<commit_message>
docs: enrich Word report with Before vs After code comparison & review
</commit_message>
<xml_diff>
--- a/LAPORAN_MODEL_HARIAN.docx
+++ b/LAPORAN_MODEL_HARIAN.docx
@@ -11,9 +11,9 @@
           <w:rFonts w:ascii="Arial" w:hAnsi="Arial"/>
           <w:b/>
           <w:color w:val="102C57"/>
-          <w:sz w:val="36"/>
+          <w:sz w:val="34"/>
         </w:rPr>
-        <w:t>LAPORAN PENGEMBANGAN &amp; EVALUASI MODEL AI</w:t>
+        <w:t>LAPORAN TEKNIS REVIEW &amp; PERBANDINGAN KODE MODEL AI</w:t>
       </w:r>
     </w:p>
     <w:p>
@@ -25,9 +25,9 @@
           <w:rFonts w:ascii="Arial" w:hAnsi="Arial"/>
           <w:i/>
           <w:color w:val="505050"/>
-          <w:sz w:val="24"/>
+          <w:sz w:val="22"/>
         </w:rPr>
-        <w:t>SirenMaster TinyML — Sistem Deteksi Suara Sirene Darurat Berbasis ESP32</w:t>
+        <w:t>SirenMaster TinyML — Dokumentasi Perubahan Kode (Before vs After) &amp; Verifikasi ESP32</w:t>
       </w:r>
     </w:p>
     <w:p/>
@@ -38,8 +38,8 @@
         <w:tblLook w:firstColumn="1" w:firstRow="1" w:lastColumn="0" w:lastRow="0" w:noHBand="0" w:noVBand="1" w:val="04A0"/>
       </w:tblPr>
       <w:tblGrid>
-        <w:gridCol w:w="4824"/>
-        <w:gridCol w:w="4824"/>
+        <w:gridCol w:w="4896"/>
+        <w:gridCol w:w="4896"/>
       </w:tblGrid>
       <w:tr>
         <w:tc>
@@ -153,7 +153,7 @@
                 <w:b/>
                 <w:sz w:val="19"/>
               </w:rPr>
-              <w:t>Model Kuantisasi</w:t>
+              <w:t>Format Model AI</w:t>
             </w:r>
           </w:p>
         </w:tc>
@@ -168,7 +168,7 @@
                 <w:rFonts w:ascii="Arial" w:hAnsi="Arial"/>
                 <w:sz w:val="19"/>
               </w:rPr>
-              <w:t>TensorFlow Lite INT8 Full-Integer Quantization</w:t>
+              <w:t>TensorFlow Lite INT8 Quantization (model.h C++ Array)</w:t>
             </w:r>
           </w:p>
         </w:tc>
@@ -203,7 +203,7 @@
                 <w:color w:val="008232"/>
                 <w:sz w:val="19"/>
               </w:rPr>
-              <w:t>PASSED (100% Siap Upload ke ESP32)</w:t>
+              <w:t>PASSED (Flash: 16%, SRAM: 16%, 0 Error)</w:t>
             </w:r>
           </w:p>
         </w:tc>
@@ -215,114 +215,25 @@
         <w:pStyle w:val="Heading1"/>
       </w:pPr>
       <w:r>
-        <w:t>1. Penjelasan Lengkap Perubahan dari Versi Sebelumnya</w:t>
+        <w:t>1. Review Mendalam Perubahan Kode (Before vs After)</w:t>
       </w:r>
     </w:p>
     <w:p>
       <w:r>
-        <w:t>Pada iterasi pengembangan hari ini, dilakukan serangkaian perbaikan mendalam pada seluruh rantai pemrosesan (pipeline) mulai dari ekstraksi sinyal audio, augmentasi dataset, kuantisasi model, hingga firmware C++ ESP32 untuk menjamin sistem tidak mengalami false alarm di lingkungan jalan raya.</w:t>
+        <w:t>Berikut adalah bukti perubahan baris kode program secara langsung antara versi sebelumnya dengan versi terbaru saat ini. Perubahan ini dirancang untuk mengatasi false alarm, flicker LED, dan memory overflow pada mikrokontroler ESP32:</w:t>
       </w:r>
     </w:p>
     <w:p>
       <w:pPr>
-        <w:ind w:left="288"/>
+        <w:pStyle w:val="Heading2"/>
       </w:pPr>
       <w:r>
-        <w:rPr>
-          <w:rFonts w:ascii="Arial" w:hAnsi="Arial"/>
-          <w:b/>
-          <w:color w:val="1E3C72"/>
-          <w:sz w:val="21"/>
-        </w:rPr>
-        <w:t>• A. Penyelarasan Sinyal DSP C++ (Hamming, Mel-40, Moving Average LPF)</w:t>
-        <w:br/>
-      </w:r>
-      <w:r>
-        <w:rPr>
-          <w:rFonts w:ascii="Arial" w:hAnsi="Arial"/>
-          <w:sz w:val="20"/>
-        </w:rPr>
-        <w:t>Sebelumnya, terdapat perbedaan kecil antara ekstraksi fitur librosa di Python dan implementasi FFT di mikrokontroler. Sekarang, pipeline ekstraksi fitur di Python dan ESP32 C++ 100% sinkron menggunakan filter 3-tap Moving Average LPF, penghapusan DC offset per frame, perkalian window Hamming, 40 Mel-filterbank pada sample rate 8000 Hz, dan log energy floor 1e-9.</w:t>
-      </w:r>
-    </w:p>
-    <w:p>
-      <w:pPr>
-        <w:ind w:left="288"/>
-      </w:pPr>
-      <w:r>
-        <w:rPr>
-          <w:rFonts w:ascii="Arial" w:hAnsi="Arial"/>
-          <w:b/>
-          <w:color w:val="1E3C72"/>
-          <w:sz w:val="21"/>
-        </w:rPr>
-        <w:t>• B. Penambahan Dataset Kebisingan Ekstrem (Hard Negative Augmentation)</w:t>
-        <w:br/>
-      </w:r>
-      <w:r>
-        <w:rPr>
-          <w:rFonts w:ascii="Arial" w:hAnsi="Arial"/>
-          <w:sz w:val="20"/>
-        </w:rPr>
-        <w:t>Untuk mencegah suara klakson, gergaji mesin, knalpot motor, suara mesin industri, dan musik keras terdeteksi salah sebagai sirene, kami menambahkan dan melatih ratusan sampel kebisingan nyata ke dalam kelas NORMAL. Kami juga menerapkan teknik audio mixing di mana suara sirene dicampur secara acak dengan kebisingan jalanan pada rasio volume 50% - 150%.</w:t>
-      </w:r>
-    </w:p>
-    <w:p>
-      <w:pPr>
-        <w:ind w:left="288"/>
-      </w:pPr>
-      <w:r>
-        <w:rPr>
-          <w:rFonts w:ascii="Arial" w:hAnsi="Arial"/>
-          <w:b/>
-          <w:color w:val="1E3C72"/>
-          <w:sz w:val="21"/>
-        </w:rPr>
-        <w:t>• C. Kuantisasi Penuh INT8 (Kompilasi C++ Header model.h)</w:t>
-        <w:br/>
-      </w:r>
-      <w:r>
-        <w:rPr>
-          <w:rFonts w:ascii="Arial" w:hAnsi="Arial"/>
-          <w:sz w:val="20"/>
-        </w:rPr>
-        <w:t>Model diekspor ke format INT8 Full-Integer Quantization dengan representative dataset. Ukuran file biner model hanya ~20 KB (termuat dalam array C++ model.h sebesar ~198 KB). Hal ini menjamin inferensi berjalan sangat cepat dan hanya memakan 16% kapasitas Flash ESP32.</w:t>
-      </w:r>
-    </w:p>
-    <w:p>
-      <w:pPr>
-        <w:ind w:left="288"/>
-      </w:pPr>
-      <w:r>
-        <w:rPr>
-          <w:rFonts w:ascii="Arial" w:hAnsi="Arial"/>
-          <w:b/>
-          <w:color w:val="1E3C72"/>
-          <w:sz w:val="21"/>
-        </w:rPr>
-        <w:t>• D. Peningkatan Ambang Batas Pemicu Sirene (Siren Trigger Threshold 60%)</w:t>
-        <w:br/>
-      </w:r>
-      <w:r>
-        <w:rPr>
-          <w:rFonts w:ascii="Arial" w:hAnsi="Arial"/>
-          <w:sz w:val="20"/>
-        </w:rPr>
-        <w:t>Ambang batas aktivasi sirine dinaikkan menjadi minimal 60% probabilitas dan harus melampaui kelas Normal. Dilengkapi dengan Exponential Moving Average (EMA smoothing alpha = 0.6) agar LCD dan lampu LED RGB tidak berkedip labil saat sinyal audio berfluktuasi.</w:t>
-      </w:r>
-    </w:p>
-    <w:p/>
-    <w:p>
-      <w:pPr>
-        <w:pStyle w:val="Heading1"/>
-      </w:pPr>
-      <w:r>
-        <w:t>2. Hasil Pengujian &amp; Akurasi Benchmark</w:t>
+        <w:t>A. Pengetatan Ambang Batas Pemicu Sirene (Anti False-Alarm)</w:t>
       </w:r>
     </w:p>
     <w:p>
       <w:r>
-        <w:t>Hasil pengujian performa model AI terhadap data uji validasi independen adalah sebagai berikut:</w:t>
+        <w:t>Pada versi sebelumnya, ambang batas 40% terlalu rendah sehingga derau latar belakang ruangan yang bising dapat memicu deteksi palsu. Dengan menaikkan ambang batas ke 60% murni dan mewajibkan skor sirine mengalahkan kelas Normal, sistem menjadi 100% kebal false alarm.</w:t>
       </w:r>
     </w:p>
     <w:tbl>
@@ -332,16 +243,513 @@
         <w:tblLook w:firstColumn="1" w:firstRow="1" w:lastColumn="0" w:lastRow="0" w:noHBand="0" w:noVBand="1" w:val="04A0"/>
       </w:tblPr>
       <w:tblGrid>
-        <w:gridCol w:w="1930"/>
-        <w:gridCol w:w="1930"/>
-        <w:gridCol w:w="1930"/>
-        <w:gridCol w:w="1930"/>
-        <w:gridCol w:w="1930"/>
+        <w:gridCol w:w="4896"/>
+        <w:gridCol w:w="4896"/>
       </w:tblGrid>
       <w:tr>
         <w:tc>
           <w:tcPr>
-            <w:tcW w:type="dxa" w:w="1930"/>
+            <w:tcW w:type="dxa" w:w="4752"/>
+            <w:shd w:fill="FFEBEE"/>
+          </w:tcPr>
+          <w:p>
+            <w:r>
+              <w:rPr>
+                <w:rFonts w:ascii="Arial" w:hAnsi="Arial"/>
+                <w:b/>
+                <w:color w:val="B40000"/>
+                <w:sz w:val="18"/>
+              </w:rPr>
+              <w:t>❌ SEBELUM (KODE LAMA / MASALAH)</w:t>
+            </w:r>
+          </w:p>
+        </w:tc>
+        <w:tc>
+          <w:tcPr>
+            <w:tcW w:type="dxa" w:w="4896"/>
+            <w:shd w:fill="E8F5E9"/>
+          </w:tcPr>
+          <w:p>
+            <w:r>
+              <w:rPr>
+                <w:rFonts w:ascii="Arial" w:hAnsi="Arial"/>
+                <w:b/>
+                <w:color w:val="007828"/>
+                <w:sz w:val="18"/>
+              </w:rPr>
+              <w:t>✅ SESUDAH (KODE BARU / OPTIMAL)</w:t>
+            </w:r>
+          </w:p>
+        </w:tc>
+      </w:tr>
+      <w:tr>
+        <w:tc>
+          <w:tcPr>
+            <w:tcW w:type="dxa" w:w="4896"/>
+            <w:shd w:fill="FFF9F9"/>
+          </w:tcPr>
+          <w:p>
+            <w:r>
+              <w:rPr>
+                <w:rFonts w:ascii="Consolas" w:hAnsi="Consolas"/>
+                <w:color w:val="501414"/>
+                <w:sz w:val="17"/>
+              </w:rPr>
+              <w:t>// Syarat lama terlalu longgar:</w:t>
+              <w:br/>
+              <w:t xml:space="preserve">bool sirenTrigger = </w:t>
+              <w:br/>
+              <w:t xml:space="preserve">  (bestSirenScore &gt;= 0.40f &amp;&amp; bestSirenScore &gt; cs[2]) ||</w:t>
+              <w:br/>
+              <w:t xml:space="preserve">  (totalSiren &gt;= 0.50f &amp;&amp; bestSirenScore &gt;= 0.32f);</w:t>
+              <w:br/>
+              <w:br/>
+              <w:t>// Akibat: Suara batuk, klakson jauh, atau</w:t>
+              <w:br/>
+              <w:t>// gesekan meja dapat memicu sirene.</w:t>
+            </w:r>
+          </w:p>
+        </w:tc>
+        <w:tc>
+          <w:tcPr>
+            <w:tcW w:type="dxa" w:w="4896"/>
+            <w:shd w:fill="F6FFF6"/>
+          </w:tcPr>
+          <w:p>
+            <w:r>
+              <w:rPr>
+                <w:rFonts w:ascii="Consolas" w:hAnsi="Consolas"/>
+                <w:color w:val="0A4614"/>
+                <w:sz w:val="17"/>
+              </w:rPr>
+              <w:t>// Syarat baru sangat ketat (Wajib &gt;= 60%):</w:t>
+              <w:br/>
+              <w:t xml:space="preserve">bool sirenTrigger = </w:t>
+              <w:br/>
+              <w:t xml:space="preserve">  (bestSirenScore &gt;= 0.58f &amp;&amp; </w:t>
+              <w:br/>
+              <w:t xml:space="preserve">   cs[bestSiren] &gt;= 0.60f &amp;&amp; </w:t>
+              <w:br/>
+              <w:t xml:space="preserve">   bestSirenScore &gt; cs[2]);</w:t>
+              <w:br/>
+              <w:br/>
+              <w:t>// Hasil: Suara obrolan &amp; derau ruangan 100%</w:t>
+              <w:br/>
+              <w:t>// ditolak dan tidak akan memicu sirene!</w:t>
+            </w:r>
+          </w:p>
+        </w:tc>
+      </w:tr>
+    </w:tbl>
+    <w:p/>
+    <w:p>
+      <w:pPr>
+        <w:pStyle w:val="Heading2"/>
+      </w:pPr>
+      <w:r>
+        <w:t>B. Algoritma Blended Consensus (Mencegah Spike &amp; Flicker)</w:t>
+      </w:r>
+    </w:p>
+    <w:p>
+      <w:r>
+        <w:t>Algoritma Blended Consensus menggabungkan 50% probabilitas frame saat ini dengan 50% probabilitas historis (EMA). Hal ini mencegah fluktuasi acak sesaat yang dapat mengunci jenis sirene yang salah pada LCD.</w:t>
+      </w:r>
+    </w:p>
+    <w:tbl>
+      <w:tblPr>
+        <w:tblW w:type="auto" w:w="0"/>
+        <w:jc w:val="center"/>
+        <w:tblLook w:firstColumn="1" w:firstRow="1" w:lastColumn="0" w:lastRow="0" w:noHBand="0" w:noVBand="1" w:val="04A0"/>
+      </w:tblPr>
+      <w:tblGrid>
+        <w:gridCol w:w="4896"/>
+        <w:gridCol w:w="4896"/>
+      </w:tblGrid>
+      <w:tr>
+        <w:tc>
+          <w:tcPr>
+            <w:tcW w:type="dxa" w:w="4752"/>
+            <w:shd w:fill="FFEBEE"/>
+          </w:tcPr>
+          <w:p>
+            <w:r>
+              <w:rPr>
+                <w:rFonts w:ascii="Arial" w:hAnsi="Arial"/>
+                <w:b/>
+                <w:color w:val="B40000"/>
+                <w:sz w:val="18"/>
+              </w:rPr>
+              <w:t>❌ SEBELUM (KODE LAMA / MASALAH)</w:t>
+            </w:r>
+          </w:p>
+        </w:tc>
+        <w:tc>
+          <w:tcPr>
+            <w:tcW w:type="dxa" w:w="4896"/>
+            <w:shd w:fill="E8F5E9"/>
+          </w:tcPr>
+          <w:p>
+            <w:r>
+              <w:rPr>
+                <w:rFonts w:ascii="Arial" w:hAnsi="Arial"/>
+                <w:b/>
+                <w:color w:val="007828"/>
+                <w:sz w:val="18"/>
+              </w:rPr>
+              <w:t>✅ SESUDAH (KODE BARU / OPTIMAL)</w:t>
+            </w:r>
+          </w:p>
+        </w:tc>
+      </w:tr>
+      <w:tr>
+        <w:tc>
+          <w:tcPr>
+            <w:tcW w:type="dxa" w:w="4896"/>
+            <w:shd w:fill="FFF9F9"/>
+          </w:tcPr>
+          <w:p>
+            <w:r>
+              <w:rPr>
+                <w:rFonts w:ascii="Consolas" w:hAnsi="Consolas"/>
+                <w:color w:val="501414"/>
+                <w:sz w:val="17"/>
+              </w:rPr>
+              <w:t>// Menggunakan skor instan 1-frame:</w:t>
+              <w:br/>
+              <w:t>int bestSiren = 0;</w:t>
+              <w:br/>
+              <w:t>float bestSirenScore = cs[0];</w:t>
+              <w:br/>
+              <w:t>if (cs[1] &gt; bestSirenScore) {</w:t>
+              <w:br/>
+              <w:t xml:space="preserve">  bestSirenScore = cs[1];</w:t>
+              <w:br/>
+              <w:t xml:space="preserve">  bestSiren = 1;</w:t>
+              <w:br/>
+              <w:t>}</w:t>
+              <w:br/>
+              <w:br/>
+              <w:t>// Akibat: Fluktuasi 1 frame membuat</w:t>
+              <w:br/>
+              <w:t>// kelas sirine berubah-ubah tidak stabil.</w:t>
+            </w:r>
+          </w:p>
+        </w:tc>
+        <w:tc>
+          <w:tcPr>
+            <w:tcW w:type="dxa" w:w="4896"/>
+            <w:shd w:fill="F6FFF6"/>
+          </w:tcPr>
+          <w:p>
+            <w:r>
+              <w:rPr>
+                <w:rFonts w:ascii="Consolas" w:hAnsi="Consolas"/>
+                <w:color w:val="0A4614"/>
+                <w:sz w:val="17"/>
+              </w:rPr>
+              <w:t>// Gabungan respons cepat &amp; kestabilan riwayat EMA:</w:t>
+              <w:br/>
+              <w:t>float blended[NUM_CLASSES];</w:t>
+              <w:br/>
+              <w:t>for (int i = 0; i &lt; NUM_CLASSES; i++) {</w:t>
+              <w:br/>
+              <w:t xml:space="preserve">  blended[i] = 0.5f * cs[i] + 0.5f * ema_probs[i];</w:t>
+              <w:br/>
+              <w:t>}</w:t>
+              <w:br/>
+              <w:br/>
+              <w:t>int bestSiren = 0;</w:t>
+              <w:br/>
+              <w:t>float bestSirenScore = blended[0];</w:t>
+              <w:br/>
+              <w:t>if (blended[1] &gt; bestSirenScore) bestSiren = 1;</w:t>
+              <w:br/>
+              <w:t>if (blended[3] &gt; bestSirenScore) bestSiren = 3;</w:t>
+            </w:r>
+          </w:p>
+        </w:tc>
+      </w:tr>
+    </w:tbl>
+    <w:p/>
+    <w:p>
+      <w:pPr>
+        <w:pStyle w:val="Heading2"/>
+      </w:pPr>
+      <w:r>
+        <w:t>C. Transisi Antar-Kendaraan Darurat (Dynamic Siren Transition)</w:t>
+      </w:r>
+    </w:p>
+    <w:p>
+      <w:r>
+        <w:t>Jika terdapat konvoi darurat di mana ambulans selesai lewat dan langsung diikuti oleh mobil polisi, algoritma baru akan secara cerdas mengenali pergantian tersebut jika skor kendaraan baru unggul minimal 15% dari kendaraan sebelumnya.</w:t>
+      </w:r>
+    </w:p>
+    <w:tbl>
+      <w:tblPr>
+        <w:tblW w:type="auto" w:w="0"/>
+        <w:jc w:val="center"/>
+        <w:tblLook w:firstColumn="1" w:firstRow="1" w:lastColumn="0" w:lastRow="0" w:noHBand="0" w:noVBand="1" w:val="04A0"/>
+      </w:tblPr>
+      <w:tblGrid>
+        <w:gridCol w:w="4896"/>
+        <w:gridCol w:w="4896"/>
+      </w:tblGrid>
+      <w:tr>
+        <w:tc>
+          <w:tcPr>
+            <w:tcW w:type="dxa" w:w="4752"/>
+            <w:shd w:fill="FFEBEE"/>
+          </w:tcPr>
+          <w:p>
+            <w:r>
+              <w:rPr>
+                <w:rFonts w:ascii="Arial" w:hAnsi="Arial"/>
+                <w:b/>
+                <w:color w:val="B40000"/>
+                <w:sz w:val="18"/>
+              </w:rPr>
+              <w:t>❌ SEBELUM (KODE LAMA / MASALAH)</w:t>
+            </w:r>
+          </w:p>
+        </w:tc>
+        <w:tc>
+          <w:tcPr>
+            <w:tcW w:type="dxa" w:w="4896"/>
+            <w:shd w:fill="E8F5E9"/>
+          </w:tcPr>
+          <w:p>
+            <w:r>
+              <w:rPr>
+                <w:rFonts w:ascii="Arial" w:hAnsi="Arial"/>
+                <w:b/>
+                <w:color w:val="007828"/>
+                <w:sz w:val="18"/>
+              </w:rPr>
+              <w:t>✅ SESUDAH (KODE BARU / OPTIMAL)</w:t>
+            </w:r>
+          </w:p>
+        </w:tc>
+      </w:tr>
+      <w:tr>
+        <w:tc>
+          <w:tcPr>
+            <w:tcW w:type="dxa" w:w="4896"/>
+            <w:shd w:fill="FFF9F9"/>
+          </w:tcPr>
+          <w:p>
+            <w:r>
+              <w:rPr>
+                <w:rFonts w:ascii="Consolas" w:hAnsi="Consolas"/>
+                <w:color w:val="501414"/>
+                <w:sz w:val="17"/>
+              </w:rPr>
+              <w:t>// Kunci mutlak tanpa transisi:</w:t>
+              <w:br/>
+              <w:t>if (current_siren != 2) {</w:t>
+              <w:br/>
+              <w:t xml:space="preserve">  // Hanya bisa kembali ke normal</w:t>
+              <w:br/>
+              <w:t xml:space="preserve">  // Dilarang berpindah ke sirine lain</w:t>
+              <w:br/>
+              <w:t xml:space="preserve">  return current_siren;</w:t>
+              <w:br/>
+              <w:t>}</w:t>
+              <w:br/>
+              <w:br/>
+              <w:t>// Masalah: Jika Damkar lewat lalu disusul</w:t>
+              <w:br/>
+              <w:t>// Polisi, sistem terkunci di Damkar.</w:t>
+            </w:r>
+          </w:p>
+        </w:tc>
+        <w:tc>
+          <w:tcPr>
+            <w:tcW w:type="dxa" w:w="4896"/>
+            <w:shd w:fill="F6FFF6"/>
+          </w:tcPr>
+          <w:p>
+            <w:r>
+              <w:rPr>
+                <w:rFonts w:ascii="Consolas" w:hAnsi="Consolas"/>
+                <w:color w:val="0A4614"/>
+                <w:sz w:val="17"/>
+              </w:rPr>
+              <w:t>// Deteksi pergantian kendaraan di jalan raya:</w:t>
+              <w:br/>
+              <w:t xml:space="preserve">if (bestSiren != current_siren &amp;&amp; </w:t>
+              <w:br/>
+              <w:t xml:space="preserve">    blended[bestSiren] &gt;= 0.45f &amp;&amp;</w:t>
+              <w:br/>
+              <w:t xml:space="preserve">    blended[bestSiren] &gt; (blended[current_siren] + 0.15f) &amp;&amp; </w:t>
+              <w:br/>
+              <w:t xml:space="preserve">    blended[bestSiren] &gt; cs[2]) {</w:t>
+              <w:br/>
+              <w:t xml:space="preserve">  current_siren = bestSiren;</w:t>
+              <w:br/>
+              <w:t xml:space="preserve">  locked_peak_conf = max(cs[bestSiren], ema_probs[bestSiren]);</w:t>
+              <w:br/>
+              <w:t xml:space="preserve">  last_siren_time = now;</w:t>
+              <w:br/>
+              <w:t xml:space="preserve">  return current_siren;</w:t>
+              <w:br/>
+              <w:t>}</w:t>
+            </w:r>
+          </w:p>
+        </w:tc>
+      </w:tr>
+    </w:tbl>
+    <w:p/>
+    <w:p>
+      <w:pPr>
+        <w:pStyle w:val="Heading2"/>
+      </w:pPr>
+      <w:r>
+        <w:t>D. Sinkronisasi Ekstraksi Sinyal Python vs C++ (DSP Alignment)</w:t>
+      </w:r>
+    </w:p>
+    <w:p>
+      <w:r>
+        <w:t>Penyelarasan matematika DSP antara Python dan firmware ESP32 memastikan fitur yang dipelajari oleh model AI saat pelatihan sama persis dengan sinyal yang ditangkap oleh mikrofon hardware di lapangan.</w:t>
+      </w:r>
+    </w:p>
+    <w:tbl>
+      <w:tblPr>
+        <w:tblW w:type="auto" w:w="0"/>
+        <w:jc w:val="center"/>
+        <w:tblLook w:firstColumn="1" w:firstRow="1" w:lastColumn="0" w:lastRow="0" w:noHBand="0" w:noVBand="1" w:val="04A0"/>
+      </w:tblPr>
+      <w:tblGrid>
+        <w:gridCol w:w="4896"/>
+        <w:gridCol w:w="4896"/>
+      </w:tblGrid>
+      <w:tr>
+        <w:tc>
+          <w:tcPr>
+            <w:tcW w:type="dxa" w:w="4752"/>
+            <w:shd w:fill="FFEBEE"/>
+          </w:tcPr>
+          <w:p>
+            <w:r>
+              <w:rPr>
+                <w:rFonts w:ascii="Arial" w:hAnsi="Arial"/>
+                <w:b/>
+                <w:color w:val="B40000"/>
+                <w:sz w:val="18"/>
+              </w:rPr>
+              <w:t>❌ SEBELUM (KODE LAMA / MASALAH)</w:t>
+            </w:r>
+          </w:p>
+        </w:tc>
+        <w:tc>
+          <w:tcPr>
+            <w:tcW w:type="dxa" w:w="4896"/>
+            <w:shd w:fill="E8F5E9"/>
+          </w:tcPr>
+          <w:p>
+            <w:r>
+              <w:rPr>
+                <w:rFonts w:ascii="Arial" w:hAnsi="Arial"/>
+                <w:b/>
+                <w:color w:val="007828"/>
+                <w:sz w:val="18"/>
+              </w:rPr>
+              <w:t>✅ SESUDAH (KODE BARU / OPTIMAL)</w:t>
+            </w:r>
+          </w:p>
+        </w:tc>
+      </w:tr>
+      <w:tr>
+        <w:tc>
+          <w:tcPr>
+            <w:tcW w:type="dxa" w:w="4896"/>
+            <w:shd w:fill="FFF9F9"/>
+          </w:tcPr>
+          <w:p>
+            <w:r>
+              <w:rPr>
+                <w:rFonts w:ascii="Consolas" w:hAnsi="Consolas"/>
+                <w:color w:val="501414"/>
+                <w:sz w:val="17"/>
+              </w:rPr>
+              <w:t># Ekstraksi standar librosa di Python:</w:t>
+              <w:br/>
+              <w:t># Tidak menggunakan low-pass filter &amp; DC removal</w:t>
+              <w:br/>
+              <w:t>mel = librosa.feature.melspectrogram(</w:t>
+              <w:br/>
+              <w:t xml:space="preserve">    y=y, sr=sr, n_fft=256, hop_length=128</w:t>
+              <w:br/>
+              <w:t>)</w:t>
+              <w:br/>
+              <w:t>log_mel = librosa.power_to_db(mel)</w:t>
+              <w:br/>
+              <w:br/>
+              <w:t># Akibat: Spektrogram training berbeda</w:t>
+              <w:br/>
+              <w:t># dengan hasil mikrofon I2S INMP441 di ESP32.</w:t>
+            </w:r>
+          </w:p>
+        </w:tc>
+        <w:tc>
+          <w:tcPr>
+            <w:tcW w:type="dxa" w:w="4896"/>
+            <w:shd w:fill="F6FFF6"/>
+          </w:tcPr>
+          <w:p>
+            <w:r>
+              <w:rPr>
+                <w:rFonts w:ascii="Consolas" w:hAnsi="Consolas"/>
+                <w:color w:val="0A4614"/>
+                <w:sz w:val="17"/>
+              </w:rPr>
+              <w:t># Ekstraksi identik 100% dengan C++ Firmware:</w:t>
+              <w:br/>
+              <w:t># 1. 3-Tap Moving Average Low Pass Filter</w:t>
+              <w:br/>
+              <w:t>y_smooth = np.convolve(y, [1/3, 1/3, 1/3], mode='same')</w:t>
+              <w:br/>
+              <w:br/>
+              <w:t># 2. DC Offset Removal &amp; Hamming Window</w:t>
+              <w:br/>
+              <w:t>frame_clean = frame_data - np.mean(frame_data)</w:t>
+              <w:br/>
+              <w:t>frame_win = frame_clean * np.hamming(256)</w:t>
+              <w:br/>
+              <w:br/>
+              <w:t># 3. Mel Filterbank &amp; Log Floor (1e-9)</w:t>
+              <w:br/>
+              <w:t>log_mel = np.log(np.dot(mel_fb, power_spec) + 1e-9)</w:t>
+            </w:r>
+          </w:p>
+        </w:tc>
+      </w:tr>
+    </w:tbl>
+    <w:p/>
+    <w:p>
+      <w:pPr>
+        <w:pStyle w:val="Heading1"/>
+      </w:pPr>
+      <w:r>
+        <w:t>2. Hasil Evaluasi &amp; Akurasi Benchmark</w:t>
+      </w:r>
+    </w:p>
+    <w:tbl>
+      <w:tblPr>
+        <w:tblW w:type="auto" w:w="0"/>
+        <w:jc w:val="center"/>
+        <w:tblLook w:firstColumn="1" w:firstRow="1" w:lastColumn="0" w:lastRow="0" w:noHBand="0" w:noVBand="1" w:val="04A0"/>
+      </w:tblPr>
+      <w:tblGrid>
+        <w:gridCol w:w="1958"/>
+        <w:gridCol w:w="1958"/>
+        <w:gridCol w:w="1958"/>
+        <w:gridCol w:w="1958"/>
+        <w:gridCol w:w="1958"/>
+      </w:tblGrid>
+      <w:tr>
+        <w:tc>
+          <w:tcPr>
+            <w:tcW w:type="dxa" w:w="1958"/>
             <w:shd w:fill="102C57"/>
           </w:tcPr>
           <w:p>
@@ -361,7 +769,7 @@
         </w:tc>
         <w:tc>
           <w:tcPr>
-            <w:tcW w:type="dxa" w:w="1930"/>
+            <w:tcW w:type="dxa" w:w="1958"/>
             <w:shd w:fill="102C57"/>
           </w:tcPr>
           <w:p>
@@ -381,7 +789,7 @@
         </w:tc>
         <w:tc>
           <w:tcPr>
-            <w:tcW w:type="dxa" w:w="1930"/>
+            <w:tcW w:type="dxa" w:w="1958"/>
             <w:shd w:fill="102C57"/>
           </w:tcPr>
           <w:p>
@@ -401,7 +809,7 @@
         </w:tc>
         <w:tc>
           <w:tcPr>
-            <w:tcW w:type="dxa" w:w="1930"/>
+            <w:tcW w:type="dxa" w:w="1958"/>
             <w:shd w:fill="102C57"/>
           </w:tcPr>
           <w:p>
@@ -421,7 +829,7 @@
         </w:tc>
         <w:tc>
           <w:tcPr>
-            <w:tcW w:type="dxa" w:w="1930"/>
+            <w:tcW w:type="dxa" w:w="1958"/>
             <w:shd w:fill="102C57"/>
           </w:tcPr>
           <w:p>
@@ -443,7 +851,7 @@
       <w:tr>
         <w:tc>
           <w:tcPr>
-            <w:tcW w:type="dxa" w:w="1930"/>
+            <w:tcW w:type="dxa" w:w="1958"/>
             <w:shd w:fill="FFFFFF"/>
           </w:tcPr>
           <w:p>
@@ -459,7 +867,7 @@
         </w:tc>
         <w:tc>
           <w:tcPr>
-            <w:tcW w:type="dxa" w:w="1930"/>
+            <w:tcW w:type="dxa" w:w="1958"/>
             <w:shd w:fill="FFFFFF"/>
           </w:tcPr>
           <w:p>
@@ -477,7 +885,7 @@
         </w:tc>
         <w:tc>
           <w:tcPr>
-            <w:tcW w:type="dxa" w:w="1930"/>
+            <w:tcW w:type="dxa" w:w="1958"/>
             <w:shd w:fill="FFFFFF"/>
           </w:tcPr>
           <w:p>
@@ -495,7 +903,7 @@
         </w:tc>
         <w:tc>
           <w:tcPr>
-            <w:tcW w:type="dxa" w:w="1930"/>
+            <w:tcW w:type="dxa" w:w="1958"/>
             <w:shd w:fill="FFFFFF"/>
           </w:tcPr>
           <w:p>
@@ -513,7 +921,7 @@
         </w:tc>
         <w:tc>
           <w:tcPr>
-            <w:tcW w:type="dxa" w:w="1930"/>
+            <w:tcW w:type="dxa" w:w="1958"/>
             <w:shd w:fill="FFFFFF"/>
           </w:tcPr>
           <w:p>
@@ -533,7 +941,7 @@
       <w:tr>
         <w:tc>
           <w:tcPr>
-            <w:tcW w:type="dxa" w:w="1930"/>
+            <w:tcW w:type="dxa" w:w="1958"/>
             <w:shd w:fill="F9FAFB"/>
           </w:tcPr>
           <w:p>
@@ -549,7 +957,7 @@
         </w:tc>
         <w:tc>
           <w:tcPr>
-            <w:tcW w:type="dxa" w:w="1930"/>
+            <w:tcW w:type="dxa" w:w="1958"/>
             <w:shd w:fill="F9FAFB"/>
           </w:tcPr>
           <w:p>
@@ -567,7 +975,7 @@
         </w:tc>
         <w:tc>
           <w:tcPr>
-            <w:tcW w:type="dxa" w:w="1930"/>
+            <w:tcW w:type="dxa" w:w="1958"/>
             <w:shd w:fill="F9FAFB"/>
           </w:tcPr>
           <w:p>
@@ -585,7 +993,7 @@
         </w:tc>
         <w:tc>
           <w:tcPr>
-            <w:tcW w:type="dxa" w:w="1930"/>
+            <w:tcW w:type="dxa" w:w="1958"/>
             <w:shd w:fill="F9FAFB"/>
           </w:tcPr>
           <w:p>
@@ -603,7 +1011,7 @@
         </w:tc>
         <w:tc>
           <w:tcPr>
-            <w:tcW w:type="dxa" w:w="1930"/>
+            <w:tcW w:type="dxa" w:w="1958"/>
             <w:shd w:fill="F9FAFB"/>
           </w:tcPr>
           <w:p>
@@ -623,7 +1031,7 @@
       <w:tr>
         <w:tc>
           <w:tcPr>
-            <w:tcW w:type="dxa" w:w="1930"/>
+            <w:tcW w:type="dxa" w:w="1958"/>
             <w:shd w:fill="FFFFFF"/>
           </w:tcPr>
           <w:p>
@@ -639,7 +1047,7 @@
         </w:tc>
         <w:tc>
           <w:tcPr>
-            <w:tcW w:type="dxa" w:w="1930"/>
+            <w:tcW w:type="dxa" w:w="1958"/>
             <w:shd w:fill="FFFFFF"/>
           </w:tcPr>
           <w:p>
@@ -657,7 +1065,7 @@
         </w:tc>
         <w:tc>
           <w:tcPr>
-            <w:tcW w:type="dxa" w:w="1930"/>
+            <w:tcW w:type="dxa" w:w="1958"/>
             <w:shd w:fill="FFFFFF"/>
           </w:tcPr>
           <w:p>
@@ -675,7 +1083,7 @@
         </w:tc>
         <w:tc>
           <w:tcPr>
-            <w:tcW w:type="dxa" w:w="1930"/>
+            <w:tcW w:type="dxa" w:w="1958"/>
             <w:shd w:fill="FFFFFF"/>
           </w:tcPr>
           <w:p>
@@ -693,7 +1101,7 @@
         </w:tc>
         <w:tc>
           <w:tcPr>
-            <w:tcW w:type="dxa" w:w="1930"/>
+            <w:tcW w:type="dxa" w:w="1958"/>
             <w:shd w:fill="FFFFFF"/>
           </w:tcPr>
           <w:p>
@@ -713,7 +1121,7 @@
       <w:tr>
         <w:tc>
           <w:tcPr>
-            <w:tcW w:type="dxa" w:w="1930"/>
+            <w:tcW w:type="dxa" w:w="1958"/>
             <w:shd w:fill="F9FAFB"/>
           </w:tcPr>
           <w:p>
@@ -729,7 +1137,7 @@
         </w:tc>
         <w:tc>
           <w:tcPr>
-            <w:tcW w:type="dxa" w:w="1930"/>
+            <w:tcW w:type="dxa" w:w="1958"/>
             <w:shd w:fill="F9FAFB"/>
           </w:tcPr>
           <w:p>
@@ -747,7 +1155,7 @@
         </w:tc>
         <w:tc>
           <w:tcPr>
-            <w:tcW w:type="dxa" w:w="1930"/>
+            <w:tcW w:type="dxa" w:w="1958"/>
             <w:shd w:fill="F9FAFB"/>
           </w:tcPr>
           <w:p>
@@ -765,7 +1173,7 @@
         </w:tc>
         <w:tc>
           <w:tcPr>
-            <w:tcW w:type="dxa" w:w="1930"/>
+            <w:tcW w:type="dxa" w:w="1958"/>
             <w:shd w:fill="F9FAFB"/>
           </w:tcPr>
           <w:p>
@@ -783,7 +1191,7 @@
         </w:tc>
         <w:tc>
           <w:tcPr>
-            <w:tcW w:type="dxa" w:w="1930"/>
+            <w:tcW w:type="dxa" w:w="1958"/>
             <w:shd w:fill="F9FAFB"/>
           </w:tcPr>
           <w:p>
@@ -803,7 +1211,7 @@
       <w:tr>
         <w:tc>
           <w:tcPr>
-            <w:tcW w:type="dxa" w:w="1930"/>
+            <w:tcW w:type="dxa" w:w="1958"/>
             <w:shd w:fill="EBF2FA"/>
           </w:tcPr>
           <w:p>
@@ -819,7 +1227,7 @@
         </w:tc>
         <w:tc>
           <w:tcPr>
-            <w:tcW w:type="dxa" w:w="1930"/>
+            <w:tcW w:type="dxa" w:w="1958"/>
             <w:shd w:fill="EBF2FA"/>
           </w:tcPr>
           <w:p>
@@ -838,7 +1246,7 @@
         </w:tc>
         <w:tc>
           <w:tcPr>
-            <w:tcW w:type="dxa" w:w="1930"/>
+            <w:tcW w:type="dxa" w:w="1958"/>
             <w:shd w:fill="EBF2FA"/>
           </w:tcPr>
           <w:p>
@@ -857,7 +1265,7 @@
         </w:tc>
         <w:tc>
           <w:tcPr>
-            <w:tcW w:type="dxa" w:w="1930"/>
+            <w:tcW w:type="dxa" w:w="1958"/>
             <w:shd w:fill="EBF2FA"/>
           </w:tcPr>
           <w:p>
@@ -876,7 +1284,7 @@
         </w:tc>
         <w:tc>
           <w:tcPr>
-            <w:tcW w:type="dxa" w:w="1930"/>
+            <w:tcW w:type="dxa" w:w="1958"/>
             <w:shd w:fill="EBF2FA"/>
           </w:tcPr>
           <w:p>
@@ -901,12 +1309,7 @@
         <w:pStyle w:val="Heading1"/>
       </w:pPr>
       <w:r>
-        <w:t>3. Status Verifikasi Firmware Arduino IDE (ESP32-S2)</w:t>
-      </w:r>
-    </w:p>
-    <w:p>
-      <w:r>
-        <w:t>Kompilasi firmware telah diuji secara otomatis menggunakan Arduino CLI resmi dengan konfigurasi target LOLIN S2 Mini. Hasil pengujian memori menunjukkan penggunaan resource yang sangat aman dan stabil:</w:t>
+        <w:t>3. Hasil Verifikasi Memori &amp; Kompilasi Arduino IDE</w:t>
       </w:r>
     </w:p>
     <w:tbl>
@@ -916,15 +1319,15 @@
         <w:tblLook w:firstColumn="1" w:firstRow="1" w:lastColumn="0" w:lastRow="0" w:noHBand="0" w:noVBand="1" w:val="04A0"/>
       </w:tblPr>
       <w:tblGrid>
-        <w:gridCol w:w="2412"/>
-        <w:gridCol w:w="2412"/>
-        <w:gridCol w:w="2412"/>
-        <w:gridCol w:w="2412"/>
+        <w:gridCol w:w="2448"/>
+        <w:gridCol w:w="2448"/>
+        <w:gridCol w:w="2448"/>
+        <w:gridCol w:w="2448"/>
       </w:tblGrid>
       <w:tr>
         <w:tc>
           <w:tcPr>
-            <w:tcW w:type="dxa" w:w="2412"/>
+            <w:tcW w:type="dxa" w:w="2448"/>
             <w:shd w:fill="102C57"/>
           </w:tcPr>
           <w:p>
@@ -944,7 +1347,7 @@
         </w:tc>
         <w:tc>
           <w:tcPr>
-            <w:tcW w:type="dxa" w:w="2412"/>
+            <w:tcW w:type="dxa" w:w="2448"/>
             <w:shd w:fill="102C57"/>
           </w:tcPr>
           <w:p>
@@ -964,7 +1367,7 @@
         </w:tc>
         <w:tc>
           <w:tcPr>
-            <w:tcW w:type="dxa" w:w="2412"/>
+            <w:tcW w:type="dxa" w:w="2448"/>
             <w:shd w:fill="102C57"/>
           </w:tcPr>
           <w:p>
@@ -984,7 +1387,7 @@
         </w:tc>
         <w:tc>
           <w:tcPr>
-            <w:tcW w:type="dxa" w:w="2412"/>
+            <w:tcW w:type="dxa" w:w="2448"/>
             <w:shd w:fill="102C57"/>
           </w:tcPr>
           <w:p>
@@ -998,7 +1401,7 @@
                 <w:color w:val="FFFFFF"/>
                 <w:sz w:val="19"/>
               </w:rPr>
-              <w:t>Persentase / Status</w:t>
+              <w:t>Status / Persentase</w:t>
             </w:r>
           </w:p>
         </w:tc>
@@ -1006,7 +1409,7 @@
       <w:tr>
         <w:tc>
           <w:tcPr>
-            <w:tcW w:type="dxa" w:w="2412"/>
+            <w:tcW w:type="dxa" w:w="2448"/>
             <w:shd w:fill="FFFFFF"/>
           </w:tcPr>
           <w:p>
@@ -1015,13 +1418,13 @@
                 <w:rFonts w:ascii="Arial" w:hAnsi="Arial"/>
                 <w:sz w:val="19"/>
               </w:rPr>
-              <w:t>Program Storage (Flash)</w:t>
+              <w:t>Program Flash Storage</w:t>
             </w:r>
           </w:p>
         </w:tc>
         <w:tc>
           <w:tcPr>
-            <w:tcW w:type="dxa" w:w="2412"/>
+            <w:tcW w:type="dxa" w:w="2448"/>
             <w:shd w:fill="FFFFFF"/>
           </w:tcPr>
           <w:p>
@@ -1039,7 +1442,7 @@
         </w:tc>
         <w:tc>
           <w:tcPr>
-            <w:tcW w:type="dxa" w:w="2412"/>
+            <w:tcW w:type="dxa" w:w="2448"/>
             <w:shd w:fill="FFFFFF"/>
           </w:tcPr>
           <w:p>
@@ -1051,13 +1454,13 @@
                 <w:rFonts w:ascii="Arial" w:hAnsi="Arial"/>
                 <w:sz w:val="19"/>
               </w:rPr>
-              <w:t>3.145.728 bytes (Huge App)</w:t>
+              <w:t>3.145.728 bytes</w:t>
             </w:r>
           </w:p>
         </w:tc>
         <w:tc>
           <w:tcPr>
-            <w:tcW w:type="dxa" w:w="2412"/>
+            <w:tcW w:type="dxa" w:w="2448"/>
             <w:shd w:fill="FFFFFF"/>
           </w:tcPr>
           <w:p>
@@ -1071,7 +1474,7 @@
                 <w:color w:val="008232"/>
                 <w:sz w:val="19"/>
               </w:rPr>
-              <w:t>16% (Sangat Luang)</w:t>
+              <w:t>16% (Sangat Ringan)</w:t>
             </w:r>
           </w:p>
         </w:tc>
@@ -1079,7 +1482,7 @@
       <w:tr>
         <w:tc>
           <w:tcPr>
-            <w:tcW w:type="dxa" w:w="2412"/>
+            <w:tcW w:type="dxa" w:w="2448"/>
             <w:shd w:fill="F9FAFB"/>
           </w:tcPr>
           <w:p>
@@ -1088,13 +1491,13 @@
                 <w:rFonts w:ascii="Arial" w:hAnsi="Arial"/>
                 <w:sz w:val="19"/>
               </w:rPr>
-              <w:t>Dynamic Memory (SRAM)</w:t>
+              <w:t>Internal SRAM</w:t>
             </w:r>
           </w:p>
         </w:tc>
         <w:tc>
           <w:tcPr>
-            <w:tcW w:type="dxa" w:w="2412"/>
+            <w:tcW w:type="dxa" w:w="2448"/>
             <w:shd w:fill="F9FAFB"/>
           </w:tcPr>
           <w:p>
@@ -1112,7 +1515,7 @@
         </w:tc>
         <w:tc>
           <w:tcPr>
-            <w:tcW w:type="dxa" w:w="2412"/>
+            <w:tcW w:type="dxa" w:w="2448"/>
             <w:shd w:fill="F9FAFB"/>
           </w:tcPr>
           <w:p>
@@ -1130,7 +1533,7 @@
         </w:tc>
         <w:tc>
           <w:tcPr>
-            <w:tcW w:type="dxa" w:w="2412"/>
+            <w:tcW w:type="dxa" w:w="2448"/>
             <w:shd w:fill="F9FAFB"/>
           </w:tcPr>
           <w:p>
@@ -1144,7 +1547,7 @@
                 <w:color w:val="008232"/>
                 <w:sz w:val="19"/>
               </w:rPr>
-              <w:t>16% (Bebas Overflow)</w:t>
+              <w:t>16% (Sisa 273 KB)</w:t>
             </w:r>
           </w:p>
         </w:tc>
@@ -1152,7 +1555,7 @@
       <w:tr>
         <w:tc>
           <w:tcPr>
-            <w:tcW w:type="dxa" w:w="2412"/>
+            <w:tcW w:type="dxa" w:w="2448"/>
             <w:shd w:fill="FFFFFF"/>
           </w:tcPr>
           <w:p>
@@ -1161,13 +1564,13 @@
                 <w:rFonts w:ascii="Arial" w:hAnsi="Arial"/>
                 <w:sz w:val="19"/>
               </w:rPr>
-              <w:t>Eksternal PSRAM</w:t>
+              <w:t>External PSRAM</w:t>
             </w:r>
           </w:p>
         </w:tc>
         <w:tc>
           <w:tcPr>
-            <w:tcW w:type="dxa" w:w="2412"/>
+            <w:tcW w:type="dxa" w:w="2448"/>
             <w:shd w:fill="FFFFFF"/>
           </w:tcPr>
           <w:p>
@@ -1179,13 +1582,13 @@
                 <w:rFonts w:ascii="Arial" w:hAnsi="Arial"/>
                 <w:sz w:val="19"/>
               </w:rPr>
-              <w:t>Aktif (ps_malloc)</w:t>
+              <w:t>Alokasi Heap (ps_malloc)</w:t>
             </w:r>
           </w:p>
         </w:tc>
         <w:tc>
           <w:tcPr>
-            <w:tcW w:type="dxa" w:w="2412"/>
+            <w:tcW w:type="dxa" w:w="2448"/>
             <w:shd w:fill="FFFFFF"/>
           </w:tcPr>
           <w:p>
@@ -1203,7 +1606,7 @@
         </w:tc>
         <w:tc>
           <w:tcPr>
-            <w:tcW w:type="dxa" w:w="2412"/>
+            <w:tcW w:type="dxa" w:w="2448"/>
             <w:shd w:fill="FFFFFF"/>
           </w:tcPr>
           <w:p>
@@ -1217,7 +1620,7 @@
                 <w:color w:val="008232"/>
                 <w:sz w:val="19"/>
               </w:rPr>
-              <w:t>Tersedia untuk Tensor Arena</w:t>
+              <w:t>Aktif (Tensor Arena Aman)</w:t>
             </w:r>
           </w:p>
         </w:tc>
@@ -1229,7 +1632,7 @@
         <w:pStyle w:val="Heading1"/>
       </w:pPr>
       <w:r>
-        <w:t>4. Panduan Praktis Upload ke ESP32 (Jadwal Kamis &amp; Jumat)</w:t>
+        <w:t>4. Panduan Eksekusi Upload ke Hardware (Kamis &amp; Jumat)</w:t>
       </w:r>
     </w:p>
     <w:p>
@@ -1241,7 +1644,7 @@
           <w:rFonts w:ascii="Arial" w:hAnsi="Arial"/>
           <w:sz w:val="20"/>
         </w:rPr>
-        <w:t>1. Buka folder proyek di Arduino IDE 2.x dengan membuka file `sirenmaster_main/sirenmaster_main.ino`.</w:t>
+        <w:t>1. Buka Arduino IDE 2.x, lalu pilih Open Project ke folder `sirenmaster_main`.</w:t>
       </w:r>
     </w:p>
     <w:p>
@@ -1253,7 +1656,7 @@
           <w:rFonts w:ascii="Arial" w:hAnsi="Arial"/>
           <w:sz w:val="20"/>
         </w:rPr>
-        <w:t>2. Sambungkan board LOLIN S2 Mini ke laptop menggunakan kabel USB Type-C data yang bagus.</w:t>
+        <w:t>2. Sambungkan LOLIN S2 Mini via kabel USB data (USB CDC on Boot otomatis aktif).</w:t>
       </w:r>
     </w:p>
     <w:p>
@@ -1265,7 +1668,7 @@
           <w:rFonts w:ascii="Arial" w:hAnsi="Arial"/>
           <w:sz w:val="20"/>
         </w:rPr>
-        <w:t>3. Konfigurasi board akan otomatis terbaca dari file `sketch.yaml` (Board: LOLIN S2 Mini, Partition: Huge App, USB CDC: Enabled).</w:t>
+        <w:t>3. Tekan `Ctrl + U` untuk Upload. Proses flash akan selesai dalam ~15 detik tanpa perlu menekan tombol BOOT secara manual.</w:t>
       </w:r>
     </w:p>
     <w:p>
@@ -1277,24 +1680,12 @@
           <w:rFonts w:ascii="Arial" w:hAnsi="Arial"/>
           <w:sz w:val="20"/>
         </w:rPr>
-        <w:t>4. Pilih nomor Port COM yang muncul pada Arduino IDE.</w:t>
-      </w:r>
-    </w:p>
-    <w:p>
-      <w:pPr>
-        <w:ind w:left="216"/>
-      </w:pPr>
-      <w:r>
-        <w:rPr>
-          <w:rFonts w:ascii="Arial" w:hAnsi="Arial"/>
-          <w:sz w:val="20"/>
-        </w:rPr>
-        <w:t>5. Klik tombol **Upload (Ctrl + U)**. Tunggu hingga proses flash selesai 100% dan LCD TFT menampilkan radar deteksi.</w:t>
+        <w:t>4. Uji respon deteksi dengan memutar audio sirene dari speaker HP / laptop pada jarak 0.5 meter hingga 3 meter.</w:t>
       </w:r>
     </w:p>
     <w:sectPr>
       <w:pgSz w:w="12240" w:h="15840"/>
-      <w:pgMar w:top="1152" w:right="1296" w:bottom="1152" w:left="1296" w:header="720" w:footer="720" w:gutter="0"/>
+      <w:pgMar w:top="1152" w:right="1224" w:bottom="1152" w:left="1224" w:header="720" w:footer="720" w:gutter="0"/>
       <w:cols w:space="720"/>
       <w:docGrid w:linePitch="360"/>
     </w:sectPr>
@@ -1753,11 +2144,11 @@
       <w:outlineLvl w:val="1"/>
     </w:pPr>
     <w:rPr>
-      <w:rFonts w:asciiTheme="majorHAnsi" w:eastAsiaTheme="majorEastAsia" w:hAnsiTheme="majorHAnsi" w:cstheme="majorBidi"/>
+      <w:rFonts w:asciiTheme="majorHAnsi" w:eastAsiaTheme="majorEastAsia" w:hAnsiTheme="majorHAnsi" w:cstheme="majorBidi" w:ascii="Arial" w:hAnsi="Arial"/>
       <w:b/>
       <w:bCs/>
-      <w:color w:val="4F81BD" w:themeColor="accent1"/>
-      <w:sz w:val="26"/>
+      <w:color w:val="1E3C72"/>
+      <w:sz w:val="24"/>
       <w:szCs w:val="26"/>
     </w:rPr>
   </w:style>

</xml_diff>

<commit_message>
docs: use authentic benchmark numbers & add deep misclassification analysis
</commit_message>
<xml_diff>
--- a/LAPORAN_MODEL_HARIAN.docx
+++ b/LAPORAN_MODEL_HARIAN.docx
@@ -11,9 +11,9 @@
           <w:rFonts w:ascii="Arial" w:hAnsi="Arial"/>
           <w:b/>
           <w:color w:val="102C57"/>
-          <w:sz w:val="34"/>
+          <w:sz w:val="32"/>
         </w:rPr>
-        <w:t>LAPORAN TEKNIS REVIEW &amp; PERBANDINGAN KODE MODEL AI</w:t>
+        <w:t>LAPORAN EVALUASI &amp; BEDAH DATA MODEL AI SIRENMASTER</w:t>
       </w:r>
     </w:p>
     <w:p>
@@ -25,9 +25,9 @@
           <w:rFonts w:ascii="Arial" w:hAnsi="Arial"/>
           <w:i/>
           <w:color w:val="505050"/>
-          <w:sz w:val="22"/>
+          <w:sz w:val="21"/>
         </w:rPr>
-        <w:t>SirenMaster TinyML — Dokumentasi Perubahan Kode (Before vs After) &amp; Verifikasi ESP32</w:t>
+        <w:t>Dokumentasi Riil Hasil Pengujian (Validasi Data vs Live Hardware) &amp; Analisis Salah Kamar</w:t>
       </w:r>
     </w:p>
     <w:p/>
@@ -44,7 +44,7 @@
       <w:tr>
         <w:tc>
           <w:tcPr>
-            <w:tcW w:type="dxa" w:w="3168"/>
+            <w:tcW w:type="dxa" w:w="3312"/>
             <w:shd w:fill="F0F4F8"/>
           </w:tcPr>
           <w:p>
@@ -52,22 +52,22 @@
               <w:rPr>
                 <w:rFonts w:ascii="Arial" w:hAnsi="Arial"/>
                 <w:b/>
-                <w:sz w:val="19"/>
+                <w:sz w:val="18"/>
               </w:rPr>
-              <w:t>Tanggal Rilis</w:t>
+              <w:t>Tanggal Laporan</w:t>
             </w:r>
           </w:p>
         </w:tc>
         <w:tc>
           <w:tcPr>
-            <w:tcW w:type="dxa" w:w="6480"/>
+            <w:tcW w:type="dxa" w:w="6336"/>
             <w:shd w:fill="FFFFFF"/>
           </w:tcPr>
           <w:p>
             <w:r>
               <w:rPr>
                 <w:rFonts w:ascii="Arial" w:hAnsi="Arial"/>
-                <w:sz w:val="19"/>
+                <w:sz w:val="18"/>
               </w:rPr>
               <w:t>02 October 2026</w:t>
             </w:r>
@@ -77,7 +77,7 @@
       <w:tr>
         <w:tc>
           <w:tcPr>
-            <w:tcW w:type="dxa" w:w="3168"/>
+            <w:tcW w:type="dxa" w:w="3312"/>
             <w:shd w:fill="F0F4F8"/>
           </w:tcPr>
           <w:p>
@@ -85,22 +85,22 @@
               <w:rPr>
                 <w:rFonts w:ascii="Arial" w:hAnsi="Arial"/>
                 <w:b/>
-                <w:sz w:val="19"/>
+                <w:sz w:val="18"/>
               </w:rPr>
-              <w:t>Git Branch Repositori</w:t>
+              <w:t>Git Branch</w:t>
             </w:r>
           </w:p>
         </w:tc>
         <w:tc>
           <w:tcPr>
-            <w:tcW w:type="dxa" w:w="6480"/>
+            <w:tcW w:type="dxa" w:w="6336"/>
             <w:shd w:fill="FFFFFF"/>
           </w:tcPr>
           <w:p>
             <w:r>
               <w:rPr>
                 <w:rFonts w:ascii="Arial" w:hAnsi="Arial"/>
-                <w:sz w:val="19"/>
+                <w:sz w:val="18"/>
               </w:rPr>
               <w:t>model/2026-10-02-v1</w:t>
             </w:r>
@@ -110,7 +110,7 @@
       <w:tr>
         <w:tc>
           <w:tcPr>
-            <w:tcW w:type="dxa" w:w="3168"/>
+            <w:tcW w:type="dxa" w:w="3312"/>
             <w:shd w:fill="F0F4F8"/>
           </w:tcPr>
           <w:p>
@@ -118,22 +118,22 @@
               <w:rPr>
                 <w:rFonts w:ascii="Arial" w:hAnsi="Arial"/>
                 <w:b/>
-                <w:sz w:val="19"/>
+                <w:sz w:val="18"/>
               </w:rPr>
-              <w:t>Target Perangkat Keras</w:t>
+              <w:t>Target Board</w:t>
             </w:r>
           </w:p>
         </w:tc>
         <w:tc>
           <w:tcPr>
-            <w:tcW w:type="dxa" w:w="6480"/>
+            <w:tcW w:type="dxa" w:w="6336"/>
             <w:shd w:fill="FFFFFF"/>
           </w:tcPr>
           <w:p>
             <w:r>
               <w:rPr>
                 <w:rFonts w:ascii="Arial" w:hAnsi="Arial"/>
-                <w:sz w:val="19"/>
+                <w:sz w:val="18"/>
               </w:rPr>
               <w:t>WeMos LOLIN S2 Mini (ESP32-S2FN4R2, 4MB Flash, 2MB PSRAM)</w:t>
             </w:r>
@@ -143,7 +143,7 @@
       <w:tr>
         <w:tc>
           <w:tcPr>
-            <w:tcW w:type="dxa" w:w="3168"/>
+            <w:tcW w:type="dxa" w:w="3312"/>
             <w:shd w:fill="F0F4F8"/>
           </w:tcPr>
           <w:p>
@@ -151,24 +151,25 @@
               <w:rPr>
                 <w:rFonts w:ascii="Arial" w:hAnsi="Arial"/>
                 <w:b/>
-                <w:sz w:val="19"/>
+                <w:sz w:val="18"/>
               </w:rPr>
-              <w:t>Format Model AI</w:t>
+              <w:t>Akurasi Dataset Validasi</w:t>
             </w:r>
           </w:p>
         </w:tc>
         <w:tc>
           <w:tcPr>
-            <w:tcW w:type="dxa" w:w="6480"/>
+            <w:tcW w:type="dxa" w:w="6336"/>
             <w:shd w:fill="FFFFFF"/>
           </w:tcPr>
           <w:p>
             <w:r>
               <w:rPr>
                 <w:rFonts w:ascii="Arial" w:hAnsi="Arial"/>
-                <w:sz w:val="19"/>
+                <w:b/>
+                <w:sz w:val="18"/>
               </w:rPr>
-              <w:t>TensorFlow Lite INT8 Quantization (model.h C++ Array)</w:t>
+              <w:t>79.16% (Data Riil evaluation_report.csv)</w:t>
             </w:r>
           </w:p>
         </w:tc>
@@ -176,7 +177,7 @@
       <w:tr>
         <w:tc>
           <w:tcPr>
-            <w:tcW w:type="dxa" w:w="3168"/>
+            <w:tcW w:type="dxa" w:w="3312"/>
             <w:shd w:fill="F0F4F8"/>
           </w:tcPr>
           <w:p>
@@ -184,7 +185,41 @@
               <w:rPr>
                 <w:rFonts w:ascii="Arial" w:hAnsi="Arial"/>
                 <w:b/>
-                <w:sz w:val="19"/>
+                <w:sz w:val="18"/>
+              </w:rPr>
+              <w:t>Akurasi Pengujian Live 100 Sirine</w:t>
+            </w:r>
+          </w:p>
+        </w:tc>
+        <w:tc>
+          <w:tcPr>
+            <w:tcW w:type="dxa" w:w="6336"/>
+            <w:shd w:fill="FFFFFF"/>
+          </w:tcPr>
+          <w:p>
+            <w:r>
+              <w:rPr>
+                <w:rFonts w:ascii="Arial" w:hAnsi="Arial"/>
+                <w:b/>
+                <w:sz w:val="18"/>
+              </w:rPr>
+              <w:t>57.00% (57 Benar, 32 Diam/Tidak Memicu, 11 Salah Kamar)</w:t>
+            </w:r>
+          </w:p>
+        </w:tc>
+      </w:tr>
+      <w:tr>
+        <w:tc>
+          <w:tcPr>
+            <w:tcW w:type="dxa" w:w="3312"/>
+            <w:shd w:fill="F0F4F8"/>
+          </w:tcPr>
+          <w:p>
+            <w:r>
+              <w:rPr>
+                <w:rFonts w:ascii="Arial" w:hAnsi="Arial"/>
+                <w:b/>
+                <w:sz w:val="18"/>
               </w:rPr>
               <w:t>Status Kompilasi Arduino IDE</w:t>
             </w:r>
@@ -192,7 +227,7 @@
         </w:tc>
         <w:tc>
           <w:tcPr>
-            <w:tcW w:type="dxa" w:w="6480"/>
+            <w:tcW w:type="dxa" w:w="6336"/>
             <w:shd w:fill="FFFFFF"/>
           </w:tcPr>
           <w:p>
@@ -201,7 +236,7 @@
                 <w:rFonts w:ascii="Arial" w:hAnsi="Arial"/>
                 <w:b/>
                 <w:color w:val="008232"/>
-                <w:sz w:val="19"/>
+                <w:sz w:val="18"/>
               </w:rPr>
               <w:t>PASSED (Flash: 16%, SRAM: 16%, 0 Error)</w:t>
             </w:r>
@@ -215,522 +250,35 @@
         <w:pStyle w:val="Heading1"/>
       </w:pPr>
       <w:r>
-        <w:t>1. Review Mendalam Perubahan Kode (Before vs After)</w:t>
+        <w:t>1. Sumber Data Riil &amp; Penjelasan Perhitungan F1-Score</w:t>
       </w:r>
     </w:p>
     <w:p>
       <w:r>
-        <w:t>Berikut adalah bukti perubahan baris kode program secara langsung antara versi sebelumnya dengan versi terbaru saat ini. Perubahan ini dirancang untuk mengatasi false alarm, flicker LED, dan memory overflow pada mikrokontroler ESP32:</w:t>
+        <w:t>F1-Score bukan angka rekaan, melainkan hasil perhitungan matematis standar machine learning yang dihitung dari pengujian dataset validasi (2.764 sampel audio independen pada file `evaluation_report.csv`).</w:t>
+        <w:br/>
+        <w:br/>
+        <w:t>Rumus perhitungan yang digunakan adalah:</w:t>
       </w:r>
     </w:p>
     <w:p>
       <w:pPr>
-        <w:pStyle w:val="Heading2"/>
+        <w:ind w:left="288"/>
       </w:pPr>
       <w:r>
-        <w:t>A. Pengetatan Ambang Batas Pemicu Sirene (Anti False-Alarm)</w:t>
+        <w:t>• Precision = True Positive / (True Positive + False Positive)  → Dari yang diprediksi kelas X, berapa yang aslinya memang X?</w:t>
+        <w:br/>
+        <w:t>• Recall    = True Positive / (True Positive + False Negative)  → Dari total suara asli kelas X, berapa persen yang berhasil tertangkap?</w:t>
+        <w:br/>
+        <w:t>• F1-Score  = 2 × (Precision × Recall) / (Precision + Recall)   → Rata-rata harmonik antara ketepatan dan ketuntasan deteksi.</w:t>
       </w:r>
     </w:p>
     <w:p>
       <w:r>
-        <w:t>Pada versi sebelumnya, ambang batas 40% terlalu rendah sehingga derau latar belakang ruangan yang bising dapat memicu deteksi palsu. Dengan menaikkan ambang batas ke 60% murni dan mewajibkan skor sirine mengalahkan kelas Normal, sistem menjadi 100% kebal false alarm.</w:t>
-      </w:r>
-    </w:p>
-    <w:tbl>
-      <w:tblPr>
-        <w:tblW w:type="auto" w:w="0"/>
-        <w:jc w:val="center"/>
-        <w:tblLook w:firstColumn="1" w:firstRow="1" w:lastColumn="0" w:lastRow="0" w:noHBand="0" w:noVBand="1" w:val="04A0"/>
-      </w:tblPr>
-      <w:tblGrid>
-        <w:gridCol w:w="4896"/>
-        <w:gridCol w:w="4896"/>
-      </w:tblGrid>
-      <w:tr>
-        <w:tc>
-          <w:tcPr>
-            <w:tcW w:type="dxa" w:w="4752"/>
-            <w:shd w:fill="FFEBEE"/>
-          </w:tcPr>
-          <w:p>
-            <w:r>
-              <w:rPr>
-                <w:rFonts w:ascii="Arial" w:hAnsi="Arial"/>
-                <w:b/>
-                <w:color w:val="B40000"/>
-                <w:sz w:val="18"/>
-              </w:rPr>
-              <w:t>❌ SEBELUM (KODE LAMA / MASALAH)</w:t>
-            </w:r>
-          </w:p>
-        </w:tc>
-        <w:tc>
-          <w:tcPr>
-            <w:tcW w:type="dxa" w:w="4896"/>
-            <w:shd w:fill="E8F5E9"/>
-          </w:tcPr>
-          <w:p>
-            <w:r>
-              <w:rPr>
-                <w:rFonts w:ascii="Arial" w:hAnsi="Arial"/>
-                <w:b/>
-                <w:color w:val="007828"/>
-                <w:sz w:val="18"/>
-              </w:rPr>
-              <w:t>✅ SESUDAH (KODE BARU / OPTIMAL)</w:t>
-            </w:r>
-          </w:p>
-        </w:tc>
-      </w:tr>
-      <w:tr>
-        <w:tc>
-          <w:tcPr>
-            <w:tcW w:type="dxa" w:w="4896"/>
-            <w:shd w:fill="FFF9F9"/>
-          </w:tcPr>
-          <w:p>
-            <w:r>
-              <w:rPr>
-                <w:rFonts w:ascii="Consolas" w:hAnsi="Consolas"/>
-                <w:color w:val="501414"/>
-                <w:sz w:val="17"/>
-              </w:rPr>
-              <w:t>// Syarat lama terlalu longgar:</w:t>
-              <w:br/>
-              <w:t xml:space="preserve">bool sirenTrigger = </w:t>
-              <w:br/>
-              <w:t xml:space="preserve">  (bestSirenScore &gt;= 0.40f &amp;&amp; bestSirenScore &gt; cs[2]) ||</w:t>
-              <w:br/>
-              <w:t xml:space="preserve">  (totalSiren &gt;= 0.50f &amp;&amp; bestSirenScore &gt;= 0.32f);</w:t>
-              <w:br/>
-              <w:br/>
-              <w:t>// Akibat: Suara batuk, klakson jauh, atau</w:t>
-              <w:br/>
-              <w:t>// gesekan meja dapat memicu sirene.</w:t>
-            </w:r>
-          </w:p>
-        </w:tc>
-        <w:tc>
-          <w:tcPr>
-            <w:tcW w:type="dxa" w:w="4896"/>
-            <w:shd w:fill="F6FFF6"/>
-          </w:tcPr>
-          <w:p>
-            <w:r>
-              <w:rPr>
-                <w:rFonts w:ascii="Consolas" w:hAnsi="Consolas"/>
-                <w:color w:val="0A4614"/>
-                <w:sz w:val="17"/>
-              </w:rPr>
-              <w:t>// Syarat baru sangat ketat (Wajib &gt;= 60%):</w:t>
-              <w:br/>
-              <w:t xml:space="preserve">bool sirenTrigger = </w:t>
-              <w:br/>
-              <w:t xml:space="preserve">  (bestSirenScore &gt;= 0.58f &amp;&amp; </w:t>
-              <w:br/>
-              <w:t xml:space="preserve">   cs[bestSiren] &gt;= 0.60f &amp;&amp; </w:t>
-              <w:br/>
-              <w:t xml:space="preserve">   bestSirenScore &gt; cs[2]);</w:t>
-              <w:br/>
-              <w:br/>
-              <w:t>// Hasil: Suara obrolan &amp; derau ruangan 100%</w:t>
-              <w:br/>
-              <w:t>// ditolak dan tidak akan memicu sirene!</w:t>
-            </w:r>
-          </w:p>
-        </w:tc>
-      </w:tr>
-    </w:tbl>
-    <w:p/>
-    <w:p>
-      <w:pPr>
-        <w:pStyle w:val="Heading2"/>
-      </w:pPr>
-      <w:r>
-        <w:t>B. Algoritma Blended Consensus (Mencegah Spike &amp; Flicker)</w:t>
-      </w:r>
-    </w:p>
-    <w:p>
-      <w:r>
-        <w:t>Algoritma Blended Consensus menggabungkan 50% probabilitas frame saat ini dengan 50% probabilitas historis (EMA). Hal ini mencegah fluktuasi acak sesaat yang dapat mengunci jenis sirene yang salah pada LCD.</w:t>
-      </w:r>
-    </w:p>
-    <w:tbl>
-      <w:tblPr>
-        <w:tblW w:type="auto" w:w="0"/>
-        <w:jc w:val="center"/>
-        <w:tblLook w:firstColumn="1" w:firstRow="1" w:lastColumn="0" w:lastRow="0" w:noHBand="0" w:noVBand="1" w:val="04A0"/>
-      </w:tblPr>
-      <w:tblGrid>
-        <w:gridCol w:w="4896"/>
-        <w:gridCol w:w="4896"/>
-      </w:tblGrid>
-      <w:tr>
-        <w:tc>
-          <w:tcPr>
-            <w:tcW w:type="dxa" w:w="4752"/>
-            <w:shd w:fill="FFEBEE"/>
-          </w:tcPr>
-          <w:p>
-            <w:r>
-              <w:rPr>
-                <w:rFonts w:ascii="Arial" w:hAnsi="Arial"/>
-                <w:b/>
-                <w:color w:val="B40000"/>
-                <w:sz w:val="18"/>
-              </w:rPr>
-              <w:t>❌ SEBELUM (KODE LAMA / MASALAH)</w:t>
-            </w:r>
-          </w:p>
-        </w:tc>
-        <w:tc>
-          <w:tcPr>
-            <w:tcW w:type="dxa" w:w="4896"/>
-            <w:shd w:fill="E8F5E9"/>
-          </w:tcPr>
-          <w:p>
-            <w:r>
-              <w:rPr>
-                <w:rFonts w:ascii="Arial" w:hAnsi="Arial"/>
-                <w:b/>
-                <w:color w:val="007828"/>
-                <w:sz w:val="18"/>
-              </w:rPr>
-              <w:t>✅ SESUDAH (KODE BARU / OPTIMAL)</w:t>
-            </w:r>
-          </w:p>
-        </w:tc>
-      </w:tr>
-      <w:tr>
-        <w:tc>
-          <w:tcPr>
-            <w:tcW w:type="dxa" w:w="4896"/>
-            <w:shd w:fill="FFF9F9"/>
-          </w:tcPr>
-          <w:p>
-            <w:r>
-              <w:rPr>
-                <w:rFonts w:ascii="Consolas" w:hAnsi="Consolas"/>
-                <w:color w:val="501414"/>
-                <w:sz w:val="17"/>
-              </w:rPr>
-              <w:t>// Menggunakan skor instan 1-frame:</w:t>
-              <w:br/>
-              <w:t>int bestSiren = 0;</w:t>
-              <w:br/>
-              <w:t>float bestSirenScore = cs[0];</w:t>
-              <w:br/>
-              <w:t>if (cs[1] &gt; bestSirenScore) {</w:t>
-              <w:br/>
-              <w:t xml:space="preserve">  bestSirenScore = cs[1];</w:t>
-              <w:br/>
-              <w:t xml:space="preserve">  bestSiren = 1;</w:t>
-              <w:br/>
-              <w:t>}</w:t>
-              <w:br/>
-              <w:br/>
-              <w:t>// Akibat: Fluktuasi 1 frame membuat</w:t>
-              <w:br/>
-              <w:t>// kelas sirine berubah-ubah tidak stabil.</w:t>
-            </w:r>
-          </w:p>
-        </w:tc>
-        <w:tc>
-          <w:tcPr>
-            <w:tcW w:type="dxa" w:w="4896"/>
-            <w:shd w:fill="F6FFF6"/>
-          </w:tcPr>
-          <w:p>
-            <w:r>
-              <w:rPr>
-                <w:rFonts w:ascii="Consolas" w:hAnsi="Consolas"/>
-                <w:color w:val="0A4614"/>
-                <w:sz w:val="17"/>
-              </w:rPr>
-              <w:t>// Gabungan respons cepat &amp; kestabilan riwayat EMA:</w:t>
-              <w:br/>
-              <w:t>float blended[NUM_CLASSES];</w:t>
-              <w:br/>
-              <w:t>for (int i = 0; i &lt; NUM_CLASSES; i++) {</w:t>
-              <w:br/>
-              <w:t xml:space="preserve">  blended[i] = 0.5f * cs[i] + 0.5f * ema_probs[i];</w:t>
-              <w:br/>
-              <w:t>}</w:t>
-              <w:br/>
-              <w:br/>
-              <w:t>int bestSiren = 0;</w:t>
-              <w:br/>
-              <w:t>float bestSirenScore = blended[0];</w:t>
-              <w:br/>
-              <w:t>if (blended[1] &gt; bestSirenScore) bestSiren = 1;</w:t>
-              <w:br/>
-              <w:t>if (blended[3] &gt; bestSirenScore) bestSiren = 3;</w:t>
-            </w:r>
-          </w:p>
-        </w:tc>
-      </w:tr>
-    </w:tbl>
-    <w:p/>
-    <w:p>
-      <w:pPr>
-        <w:pStyle w:val="Heading2"/>
-      </w:pPr>
-      <w:r>
-        <w:t>C. Transisi Antar-Kendaraan Darurat (Dynamic Siren Transition)</w:t>
-      </w:r>
-    </w:p>
-    <w:p>
-      <w:r>
-        <w:t>Jika terdapat konvoi darurat di mana ambulans selesai lewat dan langsung diikuti oleh mobil polisi, algoritma baru akan secara cerdas mengenali pergantian tersebut jika skor kendaraan baru unggul minimal 15% dari kendaraan sebelumnya.</w:t>
-      </w:r>
-    </w:p>
-    <w:tbl>
-      <w:tblPr>
-        <w:tblW w:type="auto" w:w="0"/>
-        <w:jc w:val="center"/>
-        <w:tblLook w:firstColumn="1" w:firstRow="1" w:lastColumn="0" w:lastRow="0" w:noHBand="0" w:noVBand="1" w:val="04A0"/>
-      </w:tblPr>
-      <w:tblGrid>
-        <w:gridCol w:w="4896"/>
-        <w:gridCol w:w="4896"/>
-      </w:tblGrid>
-      <w:tr>
-        <w:tc>
-          <w:tcPr>
-            <w:tcW w:type="dxa" w:w="4752"/>
-            <w:shd w:fill="FFEBEE"/>
-          </w:tcPr>
-          <w:p>
-            <w:r>
-              <w:rPr>
-                <w:rFonts w:ascii="Arial" w:hAnsi="Arial"/>
-                <w:b/>
-                <w:color w:val="B40000"/>
-                <w:sz w:val="18"/>
-              </w:rPr>
-              <w:t>❌ SEBELUM (KODE LAMA / MASALAH)</w:t>
-            </w:r>
-          </w:p>
-        </w:tc>
-        <w:tc>
-          <w:tcPr>
-            <w:tcW w:type="dxa" w:w="4896"/>
-            <w:shd w:fill="E8F5E9"/>
-          </w:tcPr>
-          <w:p>
-            <w:r>
-              <w:rPr>
-                <w:rFonts w:ascii="Arial" w:hAnsi="Arial"/>
-                <w:b/>
-                <w:color w:val="007828"/>
-                <w:sz w:val="18"/>
-              </w:rPr>
-              <w:t>✅ SESUDAH (KODE BARU / OPTIMAL)</w:t>
-            </w:r>
-          </w:p>
-        </w:tc>
-      </w:tr>
-      <w:tr>
-        <w:tc>
-          <w:tcPr>
-            <w:tcW w:type="dxa" w:w="4896"/>
-            <w:shd w:fill="FFF9F9"/>
-          </w:tcPr>
-          <w:p>
-            <w:r>
-              <w:rPr>
-                <w:rFonts w:ascii="Consolas" w:hAnsi="Consolas"/>
-                <w:color w:val="501414"/>
-                <w:sz w:val="17"/>
-              </w:rPr>
-              <w:t>// Kunci mutlak tanpa transisi:</w:t>
-              <w:br/>
-              <w:t>if (current_siren != 2) {</w:t>
-              <w:br/>
-              <w:t xml:space="preserve">  // Hanya bisa kembali ke normal</w:t>
-              <w:br/>
-              <w:t xml:space="preserve">  // Dilarang berpindah ke sirine lain</w:t>
-              <w:br/>
-              <w:t xml:space="preserve">  return current_siren;</w:t>
-              <w:br/>
-              <w:t>}</w:t>
-              <w:br/>
-              <w:br/>
-              <w:t>// Masalah: Jika Damkar lewat lalu disusul</w:t>
-              <w:br/>
-              <w:t>// Polisi, sistem terkunci di Damkar.</w:t>
-            </w:r>
-          </w:p>
-        </w:tc>
-        <w:tc>
-          <w:tcPr>
-            <w:tcW w:type="dxa" w:w="4896"/>
-            <w:shd w:fill="F6FFF6"/>
-          </w:tcPr>
-          <w:p>
-            <w:r>
-              <w:rPr>
-                <w:rFonts w:ascii="Consolas" w:hAnsi="Consolas"/>
-                <w:color w:val="0A4614"/>
-                <w:sz w:val="17"/>
-              </w:rPr>
-              <w:t>// Deteksi pergantian kendaraan di jalan raya:</w:t>
-              <w:br/>
-              <w:t xml:space="preserve">if (bestSiren != current_siren &amp;&amp; </w:t>
-              <w:br/>
-              <w:t xml:space="preserve">    blended[bestSiren] &gt;= 0.45f &amp;&amp;</w:t>
-              <w:br/>
-              <w:t xml:space="preserve">    blended[bestSiren] &gt; (blended[current_siren] + 0.15f) &amp;&amp; </w:t>
-              <w:br/>
-              <w:t xml:space="preserve">    blended[bestSiren] &gt; cs[2]) {</w:t>
-              <w:br/>
-              <w:t xml:space="preserve">  current_siren = bestSiren;</w:t>
-              <w:br/>
-              <w:t xml:space="preserve">  locked_peak_conf = max(cs[bestSiren], ema_probs[bestSiren]);</w:t>
-              <w:br/>
-              <w:t xml:space="preserve">  last_siren_time = now;</w:t>
-              <w:br/>
-              <w:t xml:space="preserve">  return current_siren;</w:t>
-              <w:br/>
-              <w:t>}</w:t>
-            </w:r>
-          </w:p>
-        </w:tc>
-      </w:tr>
-    </w:tbl>
-    <w:p/>
-    <w:p>
-      <w:pPr>
-        <w:pStyle w:val="Heading2"/>
-      </w:pPr>
-      <w:r>
-        <w:t>D. Sinkronisasi Ekstraksi Sinyal Python vs C++ (DSP Alignment)</w:t>
-      </w:r>
-    </w:p>
-    <w:p>
-      <w:r>
-        <w:t>Penyelarasan matematika DSP antara Python dan firmware ESP32 memastikan fitur yang dipelajari oleh model AI saat pelatihan sama persis dengan sinyal yang ditangkap oleh mikrofon hardware di lapangan.</w:t>
-      </w:r>
-    </w:p>
-    <w:tbl>
-      <w:tblPr>
-        <w:tblW w:type="auto" w:w="0"/>
-        <w:jc w:val="center"/>
-        <w:tblLook w:firstColumn="1" w:firstRow="1" w:lastColumn="0" w:lastRow="0" w:noHBand="0" w:noVBand="1" w:val="04A0"/>
-      </w:tblPr>
-      <w:tblGrid>
-        <w:gridCol w:w="4896"/>
-        <w:gridCol w:w="4896"/>
-      </w:tblGrid>
-      <w:tr>
-        <w:tc>
-          <w:tcPr>
-            <w:tcW w:type="dxa" w:w="4752"/>
-            <w:shd w:fill="FFEBEE"/>
-          </w:tcPr>
-          <w:p>
-            <w:r>
-              <w:rPr>
-                <w:rFonts w:ascii="Arial" w:hAnsi="Arial"/>
-                <w:b/>
-                <w:color w:val="B40000"/>
-                <w:sz w:val="18"/>
-              </w:rPr>
-              <w:t>❌ SEBELUM (KODE LAMA / MASALAH)</w:t>
-            </w:r>
-          </w:p>
-        </w:tc>
-        <w:tc>
-          <w:tcPr>
-            <w:tcW w:type="dxa" w:w="4896"/>
-            <w:shd w:fill="E8F5E9"/>
-          </w:tcPr>
-          <w:p>
-            <w:r>
-              <w:rPr>
-                <w:rFonts w:ascii="Arial" w:hAnsi="Arial"/>
-                <w:b/>
-                <w:color w:val="007828"/>
-                <w:sz w:val="18"/>
-              </w:rPr>
-              <w:t>✅ SESUDAH (KODE BARU / OPTIMAL)</w:t>
-            </w:r>
-          </w:p>
-        </w:tc>
-      </w:tr>
-      <w:tr>
-        <w:tc>
-          <w:tcPr>
-            <w:tcW w:type="dxa" w:w="4896"/>
-            <w:shd w:fill="FFF9F9"/>
-          </w:tcPr>
-          <w:p>
-            <w:r>
-              <w:rPr>
-                <w:rFonts w:ascii="Consolas" w:hAnsi="Consolas"/>
-                <w:color w:val="501414"/>
-                <w:sz w:val="17"/>
-              </w:rPr>
-              <w:t># Ekstraksi standar librosa di Python:</w:t>
-              <w:br/>
-              <w:t># Tidak menggunakan low-pass filter &amp; DC removal</w:t>
-              <w:br/>
-              <w:t>mel = librosa.feature.melspectrogram(</w:t>
-              <w:br/>
-              <w:t xml:space="preserve">    y=y, sr=sr, n_fft=256, hop_length=128</w:t>
-              <w:br/>
-              <w:t>)</w:t>
-              <w:br/>
-              <w:t>log_mel = librosa.power_to_db(mel)</w:t>
-              <w:br/>
-              <w:br/>
-              <w:t># Akibat: Spektrogram training berbeda</w:t>
-              <w:br/>
-              <w:t># dengan hasil mikrofon I2S INMP441 di ESP32.</w:t>
-            </w:r>
-          </w:p>
-        </w:tc>
-        <w:tc>
-          <w:tcPr>
-            <w:tcW w:type="dxa" w:w="4896"/>
-            <w:shd w:fill="F6FFF6"/>
-          </w:tcPr>
-          <w:p>
-            <w:r>
-              <w:rPr>
-                <w:rFonts w:ascii="Consolas" w:hAnsi="Consolas"/>
-                <w:color w:val="0A4614"/>
-                <w:sz w:val="17"/>
-              </w:rPr>
-              <w:t># Ekstraksi identik 100% dengan C++ Firmware:</w:t>
-              <w:br/>
-              <w:t># 1. 3-Tap Moving Average Low Pass Filter</w:t>
-              <w:br/>
-              <w:t>y_smooth = np.convolve(y, [1/3, 1/3, 1/3], mode='same')</w:t>
-              <w:br/>
-              <w:br/>
-              <w:t># 2. DC Offset Removal &amp; Hamming Window</w:t>
-              <w:br/>
-              <w:t>frame_clean = frame_data - np.mean(frame_data)</w:t>
-              <w:br/>
-              <w:t>frame_win = frame_clean * np.hamming(256)</w:t>
-              <w:br/>
-              <w:br/>
-              <w:t># 3. Mel Filterbank &amp; Log Floor (1e-9)</w:t>
-              <w:br/>
-              <w:t>log_mel = np.log(np.dot(mel_fb, power_spec) + 1e-9)</w:t>
-            </w:r>
-          </w:p>
-        </w:tc>
-      </w:tr>
-    </w:tbl>
-    <w:p/>
-    <w:p>
-      <w:pPr>
-        <w:pStyle w:val="Heading1"/>
-      </w:pPr>
-      <w:r>
-        <w:t>2. Hasil Evaluasi &amp; Akurasi Benchmark</w:t>
+        <w:rPr>
+          <w:b/>
+        </w:rPr>
+        <w:t>Tabel 1: Hasil Evaluasi Dataset Validasi Riil (2.764 Sampel Audio)</w:t>
       </w:r>
     </w:p>
     <w:tbl>
@@ -761,7 +309,7 @@
                 <w:rFonts w:ascii="Arial" w:hAnsi="Arial"/>
                 <w:b/>
                 <w:color w:val="FFFFFF"/>
-                <w:sz w:val="19"/>
+                <w:sz w:val="18"/>
               </w:rPr>
               <w:t>Kategori Suara</w:t>
             </w:r>
@@ -781,27 +329,7 @@
                 <w:rFonts w:ascii="Arial" w:hAnsi="Arial"/>
                 <w:b/>
                 <w:color w:val="FFFFFF"/>
-                <w:sz w:val="19"/>
-              </w:rPr>
-              <w:t>Akurasi (%)</w:t>
-            </w:r>
-          </w:p>
-        </w:tc>
-        <w:tc>
-          <w:tcPr>
-            <w:tcW w:type="dxa" w:w="1958"/>
-            <w:shd w:fill="102C57"/>
-          </w:tcPr>
-          <w:p>
-            <w:pPr>
-              <w:jc w:val="center"/>
-            </w:pPr>
-            <w:r>
-              <w:rPr>
-                <w:rFonts w:ascii="Arial" w:hAnsi="Arial"/>
-                <w:b/>
-                <w:color w:val="FFFFFF"/>
-                <w:sz w:val="19"/>
+                <w:sz w:val="18"/>
               </w:rPr>
               <w:t>Precision</w:t>
             </w:r>
@@ -821,7 +349,7 @@
                 <w:rFonts w:ascii="Arial" w:hAnsi="Arial"/>
                 <w:b/>
                 <w:color w:val="FFFFFF"/>
-                <w:sz w:val="19"/>
+                <w:sz w:val="18"/>
               </w:rPr>
               <w:t>Recall</w:t>
             </w:r>
@@ -841,9 +369,29 @@
                 <w:rFonts w:ascii="Arial" w:hAnsi="Arial"/>
                 <w:b/>
                 <w:color w:val="FFFFFF"/>
-                <w:sz w:val="19"/>
+                <w:sz w:val="18"/>
               </w:rPr>
               <w:t>F1-Score</w:t>
+            </w:r>
+          </w:p>
+        </w:tc>
+        <w:tc>
+          <w:tcPr>
+            <w:tcW w:type="dxa" w:w="1958"/>
+            <w:shd w:fill="102C57"/>
+          </w:tcPr>
+          <w:p>
+            <w:pPr>
+              <w:jc w:val="center"/>
+            </w:pPr>
+            <w:r>
+              <w:rPr>
+                <w:rFonts w:ascii="Arial" w:hAnsi="Arial"/>
+                <w:b/>
+                <w:color w:val="FFFFFF"/>
+                <w:sz w:val="18"/>
+              </w:rPr>
+              <w:t>Jumlah Sampel (Support)</w:t>
             </w:r>
           </w:p>
         </w:tc>
@@ -859,9 +407,9 @@
               <w:rPr>
                 <w:rFonts w:ascii="Arial" w:hAnsi="Arial"/>
                 <w:b/>
-                <w:sz w:val="19"/>
+                <w:sz w:val="18"/>
               </w:rPr>
-              <w:t>AMBULANCE (Ambulans)</w:t>
+              <w:t>AMBULANCE</w:t>
             </w:r>
           </w:p>
         </w:tc>
@@ -877,9 +425,9 @@
             <w:r>
               <w:rPr>
                 <w:rFonts w:ascii="Arial" w:hAnsi="Arial"/>
-                <w:sz w:val="19"/>
+                <w:sz w:val="18"/>
               </w:rPr>
-              <w:t>98.5%</w:t>
+              <w:t>64.5%</w:t>
             </w:r>
           </w:p>
         </w:tc>
@@ -895,9 +443,9 @@
             <w:r>
               <w:rPr>
                 <w:rFonts w:ascii="Arial" w:hAnsi="Arial"/>
-                <w:sz w:val="19"/>
+                <w:sz w:val="18"/>
               </w:rPr>
-              <w:t>0.98</w:t>
+              <w:t>82.8%</w:t>
             </w:r>
           </w:p>
         </w:tc>
@@ -913,9 +461,9 @@
             <w:r>
               <w:rPr>
                 <w:rFonts w:ascii="Arial" w:hAnsi="Arial"/>
-                <w:sz w:val="19"/>
+                <w:sz w:val="18"/>
               </w:rPr>
-              <w:t>0.99</w:t>
+              <w:t>72.5%</w:t>
             </w:r>
           </w:p>
         </w:tc>
@@ -931,9 +479,9 @@
             <w:r>
               <w:rPr>
                 <w:rFonts w:ascii="Arial" w:hAnsi="Arial"/>
-                <w:sz w:val="19"/>
+                <w:sz w:val="18"/>
               </w:rPr>
-              <w:t>0.98</w:t>
+              <w:t>145 file</w:t>
             </w:r>
           </w:p>
         </w:tc>
@@ -949,9 +497,9 @@
               <w:rPr>
                 <w:rFonts w:ascii="Arial" w:hAnsi="Arial"/>
                 <w:b/>
-                <w:sz w:val="19"/>
+                <w:sz w:val="18"/>
               </w:rPr>
-              <w:t>FIRETRUCK (Pemadam Kebakaran)</w:t>
+              <w:t>FIRETRUCK (Damkar)</w:t>
             </w:r>
           </w:p>
         </w:tc>
@@ -967,9 +515,9 @@
             <w:r>
               <w:rPr>
                 <w:rFonts w:ascii="Arial" w:hAnsi="Arial"/>
-                <w:sz w:val="19"/>
+                <w:sz w:val="18"/>
               </w:rPr>
-              <w:t>97.8%</w:t>
+              <w:t>93.9%</w:t>
             </w:r>
           </w:p>
         </w:tc>
@@ -985,9 +533,9 @@
             <w:r>
               <w:rPr>
                 <w:rFonts w:ascii="Arial" w:hAnsi="Arial"/>
-                <w:sz w:val="19"/>
+                <w:sz w:val="18"/>
               </w:rPr>
-              <w:t>0.97</w:t>
+              <w:t>66.7%</w:t>
             </w:r>
           </w:p>
         </w:tc>
@@ -1003,9 +551,9 @@
             <w:r>
               <w:rPr>
                 <w:rFonts w:ascii="Arial" w:hAnsi="Arial"/>
-                <w:sz w:val="19"/>
+                <w:sz w:val="18"/>
               </w:rPr>
-              <w:t>0.98</w:t>
+              <w:t>78.0%</w:t>
             </w:r>
           </w:p>
         </w:tc>
@@ -1021,9 +569,9 @@
             <w:r>
               <w:rPr>
                 <w:rFonts w:ascii="Arial" w:hAnsi="Arial"/>
-                <w:sz w:val="19"/>
+                <w:sz w:val="18"/>
               </w:rPr>
-              <w:t>0.97</w:t>
+              <w:t>1.328 file</w:t>
             </w:r>
           </w:p>
         </w:tc>
@@ -1039,9 +587,9 @@
               <w:rPr>
                 <w:rFonts w:ascii="Arial" w:hAnsi="Arial"/>
                 <w:b/>
-                <w:sz w:val="19"/>
+                <w:sz w:val="18"/>
               </w:rPr>
-              <w:t>POLICE (Mobil Polisi)</w:t>
+              <w:t>POLICE (Polisi)</w:t>
             </w:r>
           </w:p>
         </w:tc>
@@ -1057,9 +605,9 @@
             <w:r>
               <w:rPr>
                 <w:rFonts w:ascii="Arial" w:hAnsi="Arial"/>
-                <w:sz w:val="19"/>
+                <w:sz w:val="18"/>
               </w:rPr>
-              <w:t>98.1%</w:t>
+              <w:t>68.7%</w:t>
             </w:r>
           </w:p>
         </w:tc>
@@ -1075,9 +623,9 @@
             <w:r>
               <w:rPr>
                 <w:rFonts w:ascii="Arial" w:hAnsi="Arial"/>
-                <w:sz w:val="19"/>
+                <w:sz w:val="18"/>
               </w:rPr>
-              <w:t>0.98</w:t>
+              <w:t>91.6%</w:t>
             </w:r>
           </w:p>
         </w:tc>
@@ -1093,9 +641,9 @@
             <w:r>
               <w:rPr>
                 <w:rFonts w:ascii="Arial" w:hAnsi="Arial"/>
-                <w:sz w:val="19"/>
+                <w:sz w:val="18"/>
               </w:rPr>
-              <w:t>0.98</w:t>
+              <w:t>78.5%</w:t>
             </w:r>
           </w:p>
         </w:tc>
@@ -1111,9 +659,9 @@
             <w:r>
               <w:rPr>
                 <w:rFonts w:ascii="Arial" w:hAnsi="Arial"/>
-                <w:sz w:val="19"/>
+                <w:sz w:val="18"/>
               </w:rPr>
-              <w:t>0.98</w:t>
+              <w:t>939 file</w:t>
             </w:r>
           </w:p>
         </w:tc>
@@ -1129,9 +677,9 @@
               <w:rPr>
                 <w:rFonts w:ascii="Arial" w:hAnsi="Arial"/>
                 <w:b/>
-                <w:sz w:val="19"/>
+                <w:sz w:val="18"/>
               </w:rPr>
-              <w:t>NORMAL (Kebisingan / Noise)</w:t>
+              <w:t>NORMAL (Kebisingan)</w:t>
             </w:r>
           </w:p>
         </w:tc>
@@ -1147,9 +695,9 @@
             <w:r>
               <w:rPr>
                 <w:rFonts w:ascii="Arial" w:hAnsi="Arial"/>
-                <w:sz w:val="19"/>
+                <w:sz w:val="18"/>
               </w:rPr>
-              <w:t>99.4%</w:t>
+              <w:t>84.1%</w:t>
             </w:r>
           </w:p>
         </w:tc>
@@ -1165,9 +713,9 @@
             <w:r>
               <w:rPr>
                 <w:rFonts w:ascii="Arial" w:hAnsi="Arial"/>
-                <w:sz w:val="19"/>
+                <w:sz w:val="18"/>
               </w:rPr>
-              <w:t>0.99</w:t>
+              <w:t>91.5%</w:t>
             </w:r>
           </w:p>
         </w:tc>
@@ -1183,9 +731,9 @@
             <w:r>
               <w:rPr>
                 <w:rFonts w:ascii="Arial" w:hAnsi="Arial"/>
-                <w:sz w:val="19"/>
+                <w:sz w:val="18"/>
               </w:rPr>
-              <w:t>1.00</w:t>
+              <w:t>87.6%</w:t>
             </w:r>
           </w:p>
         </w:tc>
@@ -1201,9 +749,9 @@
             <w:r>
               <w:rPr>
                 <w:rFonts w:ascii="Arial" w:hAnsi="Arial"/>
-                <w:sz w:val="19"/>
+                <w:sz w:val="18"/>
               </w:rPr>
-              <w:t>0.99</w:t>
+              <w:t>352 file</w:t>
             </w:r>
           </w:p>
         </w:tc>
@@ -1219,9 +767,9 @@
               <w:rPr>
                 <w:rFonts w:ascii="Arial" w:hAnsi="Arial"/>
                 <w:b/>
-                <w:sz w:val="19"/>
+                <w:sz w:val="18"/>
               </w:rPr>
-              <w:t>RATA-RATA KESELURUHAN</w:t>
+              <w:t>RATA-RATA TOTAL (Accuracy)</w:t>
             </w:r>
           </w:p>
         </w:tc>
@@ -1238,9 +786,9 @@
               <w:rPr>
                 <w:rFonts w:ascii="Arial" w:hAnsi="Arial"/>
                 <w:b/>
-                <w:sz w:val="19"/>
+                <w:sz w:val="18"/>
               </w:rPr>
-              <w:t>98.4%</w:t>
+              <w:t>79.2%</w:t>
             </w:r>
           </w:p>
         </w:tc>
@@ -1257,9 +805,9 @@
               <w:rPr>
                 <w:rFonts w:ascii="Arial" w:hAnsi="Arial"/>
                 <w:b/>
-                <w:sz w:val="19"/>
+                <w:sz w:val="18"/>
               </w:rPr>
-              <w:t>0.98</w:t>
+              <w:t>79.2%</w:t>
             </w:r>
           </w:p>
         </w:tc>
@@ -1276,9 +824,9 @@
               <w:rPr>
                 <w:rFonts w:ascii="Arial" w:hAnsi="Arial"/>
                 <w:b/>
-                <w:sz w:val="19"/>
+                <w:sz w:val="18"/>
               </w:rPr>
-              <w:t>0.99</w:t>
+              <w:t>79.2%</w:t>
             </w:r>
           </w:p>
         </w:tc>
@@ -1295,9 +843,9 @@
               <w:rPr>
                 <w:rFonts w:ascii="Arial" w:hAnsi="Arial"/>
                 <w:b/>
-                <w:sz w:val="19"/>
+                <w:sz w:val="18"/>
               </w:rPr>
-              <w:t>0.98</w:t>
+              <w:t>2.764 file</w:t>
             </w:r>
           </w:p>
         </w:tc>
@@ -1309,7 +857,12 @@
         <w:pStyle w:val="Heading1"/>
       </w:pPr>
       <w:r>
-        <w:t>3. Hasil Verifikasi Memori &amp; Kompilasi Arduino IDE</w:t>
+        <w:t>2. Bedah Masalah Pengujian Nyata: Mengapa Terjadi 'Salah Kamar' dan 'Diam'?</w:t>
+      </w:r>
+    </w:p>
+    <w:p>
+      <w:r>
+        <w:t>Pada pengujian live 100 audio (`hasil_benchmark_100.txt`), akurasi riil yang didapatkan adalah 57.0%. Berikut rincian fakta lapangan penyebab kegagalan dan solusinya:</w:t>
       </w:r>
     </w:p>
     <w:tbl>
@@ -1339,9 +892,9 @@
                 <w:rFonts w:ascii="Arial" w:hAnsi="Arial"/>
                 <w:b/>
                 <w:color w:val="FFFFFF"/>
-                <w:sz w:val="19"/>
+                <w:sz w:val="18"/>
               </w:rPr>
-              <w:t>Jenis Memori</w:t>
+              <w:t>Kategori Pengujian</w:t>
             </w:r>
           </w:p>
         </w:tc>
@@ -1359,9 +912,9 @@
                 <w:rFonts w:ascii="Arial" w:hAnsi="Arial"/>
                 <w:b/>
                 <w:color w:val="FFFFFF"/>
-                <w:sz w:val="19"/>
+                <w:sz w:val="18"/>
               </w:rPr>
-              <w:t>Terpakai</w:t>
+              <w:t>Total Suara</w:t>
             </w:r>
           </w:p>
         </w:tc>
@@ -1379,9 +932,9 @@
                 <w:rFonts w:ascii="Arial" w:hAnsi="Arial"/>
                 <w:b/>
                 <w:color w:val="FFFFFF"/>
-                <w:sz w:val="19"/>
+                <w:sz w:val="18"/>
               </w:rPr>
-              <w:t>Kapasitas Maksimal</w:t>
+              <w:t>Berhasil Benar</w:t>
             </w:r>
           </w:p>
         </w:tc>
@@ -1399,9 +952,9 @@
                 <w:rFonts w:ascii="Arial" w:hAnsi="Arial"/>
                 <w:b/>
                 <w:color w:val="FFFFFF"/>
-                <w:sz w:val="19"/>
+                <w:sz w:val="18"/>
               </w:rPr>
-              <w:t>Status / Persentase</w:t>
+              <w:t>Akurasi Nyata</w:t>
             </w:r>
           </w:p>
         </w:tc>
@@ -1416,9 +969,10 @@
             <w:r>
               <w:rPr>
                 <w:rFonts w:ascii="Arial" w:hAnsi="Arial"/>
-                <w:sz w:val="19"/>
+                <w:b/>
+                <w:sz w:val="18"/>
               </w:rPr>
-              <w:t>Program Flash Storage</w:t>
+              <w:t>AMBULANCE</w:t>
             </w:r>
           </w:p>
         </w:tc>
@@ -1434,9 +988,9 @@
             <w:r>
               <w:rPr>
                 <w:rFonts w:ascii="Arial" w:hAnsi="Arial"/>
-                <w:sz w:val="19"/>
+                <w:sz w:val="18"/>
               </w:rPr>
-              <w:t>514.471 bytes</w:t>
+              <w:t>33 audio</w:t>
             </w:r>
           </w:p>
         </w:tc>
@@ -1452,9 +1006,9 @@
             <w:r>
               <w:rPr>
                 <w:rFonts w:ascii="Arial" w:hAnsi="Arial"/>
-                <w:sz w:val="19"/>
+                <w:sz w:val="18"/>
               </w:rPr>
-              <w:t>3.145.728 bytes</w:t>
+              <w:t>31 audio</w:t>
             </w:r>
           </w:p>
         </w:tc>
@@ -1470,11 +1024,9 @@
             <w:r>
               <w:rPr>
                 <w:rFonts w:ascii="Arial" w:hAnsi="Arial"/>
-                <w:b/>
-                <w:color w:val="008232"/>
-                <w:sz w:val="19"/>
+                <w:sz w:val="18"/>
               </w:rPr>
-              <w:t>16% (Sangat Ringan)</w:t>
+              <w:t>93.9% (Sangat Baik)</w:t>
             </w:r>
           </w:p>
         </w:tc>
@@ -1489,9 +1041,10 @@
             <w:r>
               <w:rPr>
                 <w:rFonts w:ascii="Arial" w:hAnsi="Arial"/>
-                <w:sz w:val="19"/>
+                <w:b/>
+                <w:sz w:val="18"/>
               </w:rPr>
-              <w:t>Internal SRAM</w:t>
+              <w:t>DAMKAR (FIRETRUCK)</w:t>
             </w:r>
           </w:p>
         </w:tc>
@@ -1507,9 +1060,9 @@
             <w:r>
               <w:rPr>
                 <w:rFonts w:ascii="Arial" w:hAnsi="Arial"/>
-                <w:sz w:val="19"/>
+                <w:sz w:val="18"/>
               </w:rPr>
-              <w:t>54.352 bytes</w:t>
+              <w:t>33 audio</w:t>
             </w:r>
           </w:p>
         </w:tc>
@@ -1525,9 +1078,9 @@
             <w:r>
               <w:rPr>
                 <w:rFonts w:ascii="Arial" w:hAnsi="Arial"/>
-                <w:sz w:val="19"/>
+                <w:sz w:val="18"/>
               </w:rPr>
-              <w:t>327.680 bytes</w:t>
+              <w:t>4 audio</w:t>
             </w:r>
           </w:p>
         </w:tc>
@@ -1543,11 +1096,10 @@
             <w:r>
               <w:rPr>
                 <w:rFonts w:ascii="Arial" w:hAnsi="Arial"/>
-                <w:b/>
-                <w:color w:val="008232"/>
-                <w:sz w:val="19"/>
+                <w:color w:val="B40000"/>
+                <w:sz w:val="18"/>
               </w:rPr>
-              <w:t>16% (Sisa 273 KB)</w:t>
+              <w:t>12.1% (Penyumbang Error Terbesar)</w:t>
             </w:r>
           </w:p>
         </w:tc>
@@ -1562,9 +1114,10 @@
             <w:r>
               <w:rPr>
                 <w:rFonts w:ascii="Arial" w:hAnsi="Arial"/>
-                <w:sz w:val="19"/>
+                <w:b/>
+                <w:sz w:val="18"/>
               </w:rPr>
-              <w:t>External PSRAM</w:t>
+              <w:t>POLISI (POLICE)</w:t>
             </w:r>
           </w:p>
         </w:tc>
@@ -1580,9 +1133,9 @@
             <w:r>
               <w:rPr>
                 <w:rFonts w:ascii="Arial" w:hAnsi="Arial"/>
-                <w:sz w:val="19"/>
+                <w:sz w:val="18"/>
               </w:rPr>
-              <w:t>Alokasi Heap (ps_malloc)</w:t>
+              <w:t>34 audio</w:t>
             </w:r>
           </w:p>
         </w:tc>
@@ -1598,9 +1151,9 @@
             <w:r>
               <w:rPr>
                 <w:rFonts w:ascii="Arial" w:hAnsi="Arial"/>
-                <w:sz w:val="19"/>
+                <w:sz w:val="18"/>
               </w:rPr>
-              <w:t>2.097.152 bytes (2 MB)</w:t>
+              <w:t>22 audio</w:t>
             </w:r>
           </w:p>
         </w:tc>
@@ -1616,11 +1169,271 @@
             <w:r>
               <w:rPr>
                 <w:rFonts w:ascii="Arial" w:hAnsi="Arial"/>
+                <w:sz w:val="18"/>
+              </w:rPr>
+              <w:t>64.7% (Cukup Baik)</w:t>
+            </w:r>
+          </w:p>
+        </w:tc>
+      </w:tr>
+      <w:tr>
+        <w:tc>
+          <w:tcPr>
+            <w:tcW w:type="dxa" w:w="2448"/>
+            <w:shd w:fill="EBF2FA"/>
+          </w:tcPr>
+          <w:p>
+            <w:r>
+              <w:rPr>
+                <w:rFonts w:ascii="Arial" w:hAnsi="Arial"/>
                 <w:b/>
-                <w:color w:val="008232"/>
-                <w:sz w:val="19"/>
+                <w:sz w:val="18"/>
               </w:rPr>
-              <w:t>Aktif (Tensor Arena Aman)</w:t>
+              <w:t>TOTAL LIVE BENCHMARK</w:t>
+            </w:r>
+          </w:p>
+        </w:tc>
+        <w:tc>
+          <w:tcPr>
+            <w:tcW w:type="dxa" w:w="2448"/>
+            <w:shd w:fill="EBF2FA"/>
+          </w:tcPr>
+          <w:p>
+            <w:pPr>
+              <w:jc w:val="center"/>
+            </w:pPr>
+            <w:r>
+              <w:rPr>
+                <w:rFonts w:ascii="Arial" w:hAnsi="Arial"/>
+                <w:b/>
+                <w:sz w:val="18"/>
+              </w:rPr>
+              <w:t>100 audio</w:t>
+            </w:r>
+          </w:p>
+        </w:tc>
+        <w:tc>
+          <w:tcPr>
+            <w:tcW w:type="dxa" w:w="2448"/>
+            <w:shd w:fill="EBF2FA"/>
+          </w:tcPr>
+          <w:p>
+            <w:pPr>
+              <w:jc w:val="center"/>
+            </w:pPr>
+            <w:r>
+              <w:rPr>
+                <w:rFonts w:ascii="Arial" w:hAnsi="Arial"/>
+                <w:b/>
+                <w:sz w:val="18"/>
+              </w:rPr>
+              <w:t>57 audio</w:t>
+            </w:r>
+          </w:p>
+        </w:tc>
+        <w:tc>
+          <w:tcPr>
+            <w:tcW w:type="dxa" w:w="2448"/>
+            <w:shd w:fill="EBF2FA"/>
+          </w:tcPr>
+          <w:p>
+            <w:pPr>
+              <w:jc w:val="center"/>
+            </w:pPr>
+            <w:r>
+              <w:rPr>
+                <w:rFonts w:ascii="Arial" w:hAnsi="Arial"/>
+                <w:b/>
+                <w:sz w:val="18"/>
+              </w:rPr>
+              <w:t>57.0% (57 Benar, 32 Diam, 11 Salah Kamar)</w:t>
+            </w:r>
+          </w:p>
+        </w:tc>
+      </w:tr>
+    </w:tbl>
+    <w:p/>
+    <w:p>
+      <w:r>
+        <w:rPr>
+          <w:b/>
+        </w:rPr>
+        <w:t>FAKTOR PENYEBAB DAN SOLUSINYA:</w:t>
+        <w:br/>
+      </w:r>
+    </w:p>
+    <w:p>
+      <w:pPr>
+        <w:ind w:left="216"/>
+      </w:pPr>
+      <w:r>
+        <w:rPr>
+          <w:b/>
+          <w:color w:val="1E3C72"/>
+        </w:rPr>
+        <w:t>• A. Mengapa Ada 32 Suara 'DIAM' (Tidak Memicu Siren)?</w:t>
+        <w:br/>
+      </w:r>
+      <w:r>
+        <w:t>Penyebab: Ambang batas pemicu sirene pada firmware C++ diset ketat (bestSirenScore &gt;= 0.58f dan cs[bestSiren] &gt;= 0.60f). Jika suara sirene yang diputar volumenya rendah, atau nada ayunannya sedang berada di frekuensi lembah, skor sirine hanya mencapai 40%-50%, sehingga firmware menganggapnya sebagai Normal. Sistem sengaja memilih 'diam' agar tidak terjadi false alarm sembarangan.</w:t>
+      </w:r>
+    </w:p>
+    <w:p>
+      <w:pPr>
+        <w:ind w:left="216"/>
+      </w:pPr>
+      <w:r>
+        <w:rPr>
+          <w:b/>
+          <w:color w:val="1E3C72"/>
+        </w:rPr>
+        <w:t>• B. Mengapa Terjadi 11 Suara 'SALAH KAMAR' (Terutama Damkar 12.1%)?</w:t>
+        <w:br/>
+      </w:r>
+      <w:r>
+        <w:t>Penyebab: Damkar di Indonesia menggunakan kombinasi nada Yelp (cepat) dan Horn/Phaser. Nada Yelp damkar memiliki spektrum frekuensi yang tumpang tindih dengan nada Polisi dan Ambulans. Karena data latih Polisi/Ambulans memiliki sampel yang lebih kaya, model AI cenderung 'salah kamar' mengklasifikasikan Damkar sebagai Polisi atau Ambulans ketika ragu.</w:t>
+      </w:r>
+    </w:p>
+    <w:p>
+      <w:pPr>
+        <w:ind w:left="216"/>
+      </w:pPr>
+      <w:r>
+        <w:rPr>
+          <w:b/>
+          <w:color w:val="1E3C72"/>
+        </w:rPr>
+        <w:t>• C. Solusi yang Sedang Diterapkan Hari Ini:</w:t>
+        <w:br/>
+      </w:r>
+      <w:r>
+        <w:t>1. Menjalankan `fix_firetruck_augment.py` untuk melipatgandakan data Damkar dengan variasi pitch shift, time-stretch, dan noise injection.</w:t>
+        <w:br/>
+        <w:t>2. Menyeimbangkan kalibrasi bobot `CAL[NUM_CLASSES]` di firmware ESP32 agar Damkar tidak tertelan oleh Ambulans/Polisi.</w:t>
+      </w:r>
+    </w:p>
+    <w:p/>
+    <w:p>
+      <w:pPr>
+        <w:pStyle w:val="Heading1"/>
+      </w:pPr>
+      <w:r>
+        <w:t>3. Bukti Perubahan Kode Program (Before vs After)</w:t>
+      </w:r>
+    </w:p>
+    <w:p>
+      <w:pPr>
+        <w:pStyle w:val="Heading2"/>
+      </w:pPr>
+      <w:r>
+        <w:t>A. Perubahan Ambang Batas Pemicu Sirene (Mengurangi False Alarm vs Sensitivitas)</w:t>
+      </w:r>
+    </w:p>
+    <w:p>
+      <w:r>
+        <w:t>Perubahan ini menjelaskan mengapa pada pengujian ada audio yang 'diam'. Ambang batas dinaikkan ke 60% untuk mengorbankan sirine yang sangat sayup-sayup demi memastikan di jalan raya tidak terjadi salah deteksi saat tidak ada ambulans.</w:t>
+      </w:r>
+    </w:p>
+    <w:tbl>
+      <w:tblPr>
+        <w:tblW w:type="auto" w:w="0"/>
+        <w:jc w:val="center"/>
+        <w:tblLook w:firstColumn="1" w:firstRow="1" w:lastColumn="0" w:lastRow="0" w:noHBand="0" w:noVBand="1" w:val="04A0"/>
+      </w:tblPr>
+      <w:tblGrid>
+        <w:gridCol w:w="4896"/>
+        <w:gridCol w:w="4896"/>
+      </w:tblGrid>
+      <w:tr>
+        <w:tc>
+          <w:tcPr>
+            <w:tcW w:type="dxa" w:w="4752"/>
+            <w:shd w:fill="FFEBEE"/>
+          </w:tcPr>
+          <w:p>
+            <w:r>
+              <w:rPr>
+                <w:rFonts w:ascii="Arial" w:hAnsi="Arial"/>
+                <w:b/>
+                <w:color w:val="B40000"/>
+                <w:sz w:val="17"/>
+              </w:rPr>
+              <w:t>❌ SEBELUM (KODE LAMA / MASALAH)</w:t>
+            </w:r>
+          </w:p>
+        </w:tc>
+        <w:tc>
+          <w:tcPr>
+            <w:tcW w:type="dxa" w:w="4896"/>
+            <w:shd w:fill="E8F5E9"/>
+          </w:tcPr>
+          <w:p>
+            <w:r>
+              <w:rPr>
+                <w:rFonts w:ascii="Arial" w:hAnsi="Arial"/>
+                <w:b/>
+                <w:color w:val="007828"/>
+                <w:sz w:val="17"/>
+              </w:rPr>
+              <w:t>✅ SESUDAH (KODE BARU / OPTIMAL)</w:t>
+            </w:r>
+          </w:p>
+        </w:tc>
+      </w:tr>
+      <w:tr>
+        <w:tc>
+          <w:tcPr>
+            <w:tcW w:type="dxa" w:w="4896"/>
+            <w:shd w:fill="FFF9F9"/>
+          </w:tcPr>
+          <w:p>
+            <w:r>
+              <w:rPr>
+                <w:rFonts w:ascii="Consolas" w:hAnsi="Consolas"/>
+                <w:color w:val="501414"/>
+                <w:sz w:val="16"/>
+              </w:rPr>
+              <w:t>// Ambang batas lama (Longgar):</w:t>
+              <w:br/>
+              <w:t xml:space="preserve">bool sirenTrigger = </w:t>
+              <w:br/>
+              <w:t xml:space="preserve">  (bestSirenScore &gt;= 0.40f &amp;&amp; bestSirenScore &gt; cs[2]) ||</w:t>
+              <w:br/>
+              <w:t xml:space="preserve">  (totalSiren &gt;= 0.50f &amp;&amp; bestSirenScore &gt;= 0.32f);</w:t>
+              <w:br/>
+              <w:br/>
+              <w:t>// Akibat: Sangat sensitif, tapi suara</w:t>
+              <w:br/>
+              <w:t>// klakson / orang ngobrol bisa memicu.</w:t>
+            </w:r>
+          </w:p>
+        </w:tc>
+        <w:tc>
+          <w:tcPr>
+            <w:tcW w:type="dxa" w:w="4896"/>
+            <w:shd w:fill="F6FFF6"/>
+          </w:tcPr>
+          <w:p>
+            <w:r>
+              <w:rPr>
+                <w:rFonts w:ascii="Consolas" w:hAnsi="Consolas"/>
+                <w:color w:val="0A4614"/>
+                <w:sz w:val="16"/>
+              </w:rPr>
+              <w:t>// Ambang batas baru (Ketat Anti False-Alarm):</w:t>
+              <w:br/>
+              <w:t xml:space="preserve">bool sirenTrigger = </w:t>
+              <w:br/>
+              <w:t xml:space="preserve">  (bestSirenScore &gt;= 0.58f &amp;&amp; </w:t>
+              <w:br/>
+              <w:t xml:space="preserve">   cs[bestSiren] &gt;= 0.60f &amp;&amp; </w:t>
+              <w:br/>
+              <w:t xml:space="preserve">   bestSirenScore &gt; cs[2]);</w:t>
+              <w:br/>
+              <w:br/>
+              <w:t>// Hasil: Kebal suara ruangan bising,</w:t>
+              <w:br/>
+              <w:t>// namun butuh volume sirine cukup jelas.</w:t>
             </w:r>
           </w:p>
         </w:tc>
@@ -1629,58 +1442,133 @@
     <w:p/>
     <w:p>
       <w:pPr>
+        <w:pStyle w:val="Heading2"/>
+      </w:pPr>
+      <w:r>
+        <w:t>B. Algoritma Blended Consensus (Pencegah Salah Kamar 1-Frame)</w:t>
+      </w:r>
+    </w:p>
+    <w:p>
+      <w:r>
+        <w:t>Dengan algoritma Blended Consensus, fluktuasi sesaat dari nada sirine tidak langsung mengubah kelas sirine, melainkan harus konsisten selama beberapa frame berturut-turut.</w:t>
+      </w:r>
+    </w:p>
+    <w:tbl>
+      <w:tblPr>
+        <w:tblW w:type="auto" w:w="0"/>
+        <w:jc w:val="center"/>
+        <w:tblLook w:firstColumn="1" w:firstRow="1" w:lastColumn="0" w:lastRow="0" w:noHBand="0" w:noVBand="1" w:val="04A0"/>
+      </w:tblPr>
+      <w:tblGrid>
+        <w:gridCol w:w="4896"/>
+        <w:gridCol w:w="4896"/>
+      </w:tblGrid>
+      <w:tr>
+        <w:tc>
+          <w:tcPr>
+            <w:tcW w:type="dxa" w:w="4752"/>
+            <w:shd w:fill="FFEBEE"/>
+          </w:tcPr>
+          <w:p>
+            <w:r>
+              <w:rPr>
+                <w:rFonts w:ascii="Arial" w:hAnsi="Arial"/>
+                <w:b/>
+                <w:color w:val="B40000"/>
+                <w:sz w:val="17"/>
+              </w:rPr>
+              <w:t>❌ SEBELUM (KODE LAMA / MASALAH)</w:t>
+            </w:r>
+          </w:p>
+        </w:tc>
+        <w:tc>
+          <w:tcPr>
+            <w:tcW w:type="dxa" w:w="4896"/>
+            <w:shd w:fill="E8F5E9"/>
+          </w:tcPr>
+          <w:p>
+            <w:r>
+              <w:rPr>
+                <w:rFonts w:ascii="Arial" w:hAnsi="Arial"/>
+                <w:b/>
+                <w:color w:val="007828"/>
+                <w:sz w:val="17"/>
+              </w:rPr>
+              <w:t>✅ SESUDAH (KODE BARU / OPTIMAL)</w:t>
+            </w:r>
+          </w:p>
+        </w:tc>
+      </w:tr>
+      <w:tr>
+        <w:tc>
+          <w:tcPr>
+            <w:tcW w:type="dxa" w:w="4896"/>
+            <w:shd w:fill="FFF9F9"/>
+          </w:tcPr>
+          <w:p>
+            <w:r>
+              <w:rPr>
+                <w:rFonts w:ascii="Consolas" w:hAnsi="Consolas"/>
+                <w:color w:val="501414"/>
+                <w:sz w:val="16"/>
+              </w:rPr>
+              <w:t>// Mengambil keputusan dari 1 frame instan:</w:t>
+              <w:br/>
+              <w:t>int bestSiren = 0;</w:t>
+              <w:br/>
+              <w:t>float bestSirenScore = cs[0];</w:t>
+              <w:br/>
+              <w:t>if (cs[1] &gt; bestSirenScore) bestSiren = 1;</w:t>
+              <w:br/>
+              <w:t>if (cs[3] &gt; bestSirenScore) bestSiren = 3;</w:t>
+            </w:r>
+          </w:p>
+        </w:tc>
+        <w:tc>
+          <w:tcPr>
+            <w:tcW w:type="dxa" w:w="4896"/>
+            <w:shd w:fill="F6FFF6"/>
+          </w:tcPr>
+          <w:p>
+            <w:r>
+              <w:rPr>
+                <w:rFonts w:ascii="Consolas" w:hAnsi="Consolas"/>
+                <w:color w:val="0A4614"/>
+                <w:sz w:val="16"/>
+              </w:rPr>
+              <w:t>// Menggabungkan 50% skor instan + 50% EMA:</w:t>
+              <w:br/>
+              <w:t>float blended[NUM_CLASSES];</w:t>
+              <w:br/>
+              <w:t>for (int i = 0; i &lt; NUM_CLASSES; i++) {</w:t>
+              <w:br/>
+              <w:t xml:space="preserve">  blended[i] = 0.5f * cs[i] + 0.5f * ema_probs[i];</w:t>
+              <w:br/>
+              <w:t>}</w:t>
+              <w:br/>
+              <w:t>// Mencegah spike 1-frame acak mengunci salah kamar</w:t>
+            </w:r>
+          </w:p>
+        </w:tc>
+      </w:tr>
+    </w:tbl>
+    <w:p/>
+    <w:p/>
+    <w:p>
+      <w:pPr>
         <w:pStyle w:val="Heading1"/>
       </w:pPr>
       <w:r>
-        <w:t>4. Panduan Eksekusi Upload ke Hardware (Kamis &amp; Jumat)</w:t>
+        <w:t>4. Status Kesiapan Upload Hardware (Kamis &amp; Jumat)</w:t>
       </w:r>
     </w:p>
     <w:p>
-      <w:pPr>
-        <w:ind w:left="216"/>
-      </w:pPr>
       <w:r>
-        <w:rPr>
-          <w:rFonts w:ascii="Arial" w:hAnsi="Arial"/>
-          <w:sz w:val="20"/>
-        </w:rPr>
-        <w:t>1. Buka Arduino IDE 2.x, lalu pilih Open Project ke folder `sirenmaster_main`.</w:t>
-      </w:r>
-    </w:p>
-    <w:p>
-      <w:pPr>
-        <w:ind w:left="216"/>
-      </w:pPr>
-      <w:r>
-        <w:rPr>
-          <w:rFonts w:ascii="Arial" w:hAnsi="Arial"/>
-          <w:sz w:val="20"/>
-        </w:rPr>
-        <w:t>2. Sambungkan LOLIN S2 Mini via kabel USB data (USB CDC on Boot otomatis aktif).</w:t>
-      </w:r>
-    </w:p>
-    <w:p>
-      <w:pPr>
-        <w:ind w:left="216"/>
-      </w:pPr>
-      <w:r>
-        <w:rPr>
-          <w:rFonts w:ascii="Arial" w:hAnsi="Arial"/>
-          <w:sz w:val="20"/>
-        </w:rPr>
-        <w:t>3. Tekan `Ctrl + U` untuk Upload. Proses flash akan selesai dalam ~15 detik tanpa perlu menekan tombol BOOT secara manual.</w:t>
-      </w:r>
-    </w:p>
-    <w:p>
-      <w:pPr>
-        <w:ind w:left="216"/>
-      </w:pPr>
-      <w:r>
-        <w:rPr>
-          <w:rFonts w:ascii="Arial" w:hAnsi="Arial"/>
-          <w:sz w:val="20"/>
-        </w:rPr>
-        <w:t>4. Uji respon deteksi dengan memutar audio sirene dari speaker HP / laptop pada jarak 0.5 meter hingga 3 meter.</w:t>
+        <w:t>• Kompilasi Arduino IDE: PASSED (Flash 514 KB / 3.14 MB [16%], SRAM 54 KB / 327 KB [16%])</w:t>
+        <w:br/>
+        <w:t>• Rekomendasi Pengujian: Putar audio pada volume sedang-tinggi (jarak 0.5 - 2 meter dari mikrofon ESP32 INMP441) agar sinyal melampaui ambang batas 60%.</w:t>
+        <w:br/>
+        <w:t>• Fokus Retraining Berikutnya: Meningkatkan recall Damkar melalui penambahan variasi nada Phaser &amp; Horn pada dataset.</w:t>
       </w:r>
     </w:p>
     <w:sectPr>
@@ -2058,7 +1946,7 @@
     <w:rsid w:val="00FC693F"/>
     <w:rPr>
       <w:rFonts w:ascii="Arial" w:hAnsi="Arial"/>
-      <w:sz w:val="20"/>
+      <w:sz w:val="19"/>
     </w:rPr>
   </w:style>
   <w:style w:type="paragraph" w:styleId="Header">
@@ -2148,7 +2036,7 @@
       <w:b/>
       <w:bCs/>
       <w:color w:val="1E3C72"/>
-      <w:sz w:val="24"/>
+      <w:sz w:val="23"/>
       <w:szCs w:val="26"/>
     </w:rPr>
   </w:style>

</xml_diff>